<commit_message>
rebuild deck and brief around the sourced numbers
</commit_message>
<xml_diff>
--- a/exports/Schwans_Project_Brief.docx
+++ b/exports/Schwans_Project_Brief.docx
@@ -94,7 +94,7 @@
           <w:sz w:val="21"/>
           <w:szCs w:val="21"/>
         </w:rPr>
-        <w:t xml:space="preserve">Schwan's runs 16 plants and 3 corporate offices, split into 4 job groups: Manufacturing and Logistics, Retail Sales and Distribution, Foodservice Sales, and Corporate. Skills information lives in different systems, spreadsheets, and people's heads.</w:t>
+        <w:t xml:space="preserve">Schwan's employs about 8,500 people across 16 plants and 3 corporate offices, split into 4 job groups: Manufacturing and Logistics, Retail Sales and Distribution, Foodservice Sales, and Corporate. Skills information lives in different systems, spreadsheets, and people's heads.</w:t>
       </w:r>
     </w:p>
     <w:p>
@@ -139,7 +139,7 @@
           <w:sz w:val="21"/>
           <w:szCs w:val="21"/>
         </w:rPr>
-        <w:t xml:space="preserve">It puts every tracked skill in one place and answers the five questions in the challenge, one page each.</w:t>
+        <w:t xml:space="preserve">It puts every tracked skill in one place and answers the five questions in the challenge, one page each, plus a view built for the employee rather than the manager.</w:t>
       </w:r>
     </w:p>
     <w:tbl>
@@ -267,7 +267,7 @@
                 <w:sz w:val="20"/>
                 <w:szCs w:val="20"/>
               </w:rPr>
-              <w:t xml:space="preserve">A ranked list of what to fix first, plus the biggest gaps today.</w:t>
+              <w:t xml:space="preserve">A ranked list of what to fix first, plus where coverage is lowest.</w:t>
             </w:r>
           </w:p>
         </w:tc>
@@ -436,6 +436,62 @@
                 <w:szCs w:val="20"/>
               </w:rPr>
               <w:t xml:space="preserve">What the next two years need, and how far short the workforce is now.</w:t>
+            </w:r>
+          </w:p>
+        </w:tc>
+      </w:tr>
+      <w:tr>
+        <w:tc>
+          <w:tcPr>
+            <w:tcW w:type="dxa" w:w="2600"/>
+            <w:tcMar>
+              <w:top w:type="dxa" w:w="90"/>
+              <w:left w:type="dxa" w:w="130"/>
+              <w:bottom w:type="dxa" w:w="90"/>
+              <w:right w:type="dxa" w:w="130"/>
+            </w:tcMar>
+          </w:tcPr>
+          <w:p>
+            <w:pPr>
+              <w:spacing w:after="0" w:line="280"/>
+            </w:pPr>
+            <w:r>
+              <w:rPr>
+                <w:rFonts w:ascii="Calibri" w:cs="Calibri" w:eastAsia="Calibri" w:hAnsi="Calibri"/>
+                <w:b/>
+                <w:bCs/>
+                <w:color w:val="15181D"/>
+                <w:sz w:val="20"/>
+                <w:szCs w:val="20"/>
+              </w:rPr>
+              <w:t xml:space="preserve">Employee view</w:t>
+            </w:r>
+          </w:p>
+        </w:tc>
+        <w:tc>
+          <w:tcPr>
+            <w:tcW w:type="dxa" w:w="6760"/>
+            <w:tcMar>
+              <w:top w:type="dxa" w:w="90"/>
+              <w:left w:type="dxa" w:w="130"/>
+              <w:bottom w:type="dxa" w:w="90"/>
+              <w:right w:type="dxa" w:w="130"/>
+            </w:tcMar>
+          </w:tcPr>
+          <w:p>
+            <w:pPr>
+              <w:spacing w:after="0" w:line="280"/>
+            </w:pPr>
+            <w:r>
+              <w:rPr>
+                <w:rFonts w:ascii="Calibri" w:cs="Calibri" w:eastAsia="Calibri" w:hAnsi="Calibri"/>
+                <w:b w:val="false"/>
+                <w:bCs w:val="false"/>
+                <w:color w:val="15181D"/>
+                <w:sz w:val="20"/>
+                <w:szCs w:val="20"/>
+              </w:rPr>
+              <w:t xml:space="preserve">The same data seen by the person: the skills they have, the skills only they have, and their next step.</w:t>
             </w:r>
           </w:p>
         </w:tc>
@@ -1106,7 +1162,21 @@
           <w:sz w:val="21"/>
           <w:szCs w:val="21"/>
         </w:rPr>
-        <w:t xml:space="preserve">Coverage numbers, headcounts, and employee names are made up for the demo. Plant names, office locations, job groups, and the business drivers (the Sioux Falls plant build-out, the CJ CheilJedang integration, the Marshall R&amp;D center) are real and taken from public sources. The app states this on screen so nobody mistakes the demo for a real report.</w:t>
+        <w:t xml:space="preserve">Coverage percentages, per-site headcounts, and employee records are made up for the demo. Company headcount, plant names, office locations, job groups, and the business drivers (the Sioux Falls plant build-out, the CJ CheilJedang integration, the Marshall R&amp;D center) are real and taken from public sources. The app states this on screen so nobody mistakes the demo for a real report.</w:t>
+      </w:r>
+    </w:p>
+    <w:p>
+      <w:pPr>
+        <w:spacing w:after="140" w:line="300"/>
+      </w:pPr>
+      <w:r>
+        <w:rPr>
+          <w:rFonts w:ascii="Calibri" w:cs="Calibri" w:eastAsia="Calibri" w:hAnsi="Calibri"/>
+          <w:color w:val="15181D"/>
+          <w:sz w:val="21"/>
+          <w:szCs w:val="21"/>
+        </w:rPr>
+        <w:t xml:space="preserve">The made-up numbers are shaped by published figures rather than invented. Schwan's reports about 8,500 employees. Deloitte and The Manufacturing Institute put the manufacturing skills gap at 2.1 million unfilled jobs by 2030, with baby boomer retirement named by 34 percent of manufacturers as a leading cause. The average certified ammonia refrigeration technician in the US is approaching 55 years old, which is why this demo puts two retirement-eligible techs on the Marshall ammonia system. Every source is listed inside the app.</w:t>
       </w:r>
     </w:p>
     <w:p>
@@ -1161,7 +1231,7 @@
           <w:sz w:val="21"/>
           <w:szCs w:val="21"/>
         </w:rPr>
-        <w:t xml:space="preserve">Add an employee view, so a person sees their own plan instead of only managers seeing the whole map.</w:t>
+        <w:t xml:space="preserve">Match people to plans automatically, rather than one written first step per skill.</w:t>
       </w:r>
     </w:p>
     <w:p>

</xml_diff>

<commit_message>
rebuild deck, brief and screenshots after the fact check
</commit_message>
<xml_diff>
--- a/exports/Schwans_Project_Brief.docx
+++ b/exports/Schwans_Project_Brief.docx
@@ -94,7 +94,7 @@
           <w:sz w:val="21"/>
           <w:szCs w:val="21"/>
         </w:rPr>
-        <w:t xml:space="preserve">Schwan's employs about 8,500 people across 16 plants and 3 corporate offices, split into 4 job groups: Manufacturing and Logistics, Retail Sales and Distribution, Foodservice Sales, and Corporate. Skills information lives in different systems, spreadsheets, and people's heads.</w:t>
+        <w:t xml:space="preserve">Schwan's runs more than a dozen US facilities across 4 job groups: Manufacturing and Logistics, Retail Sales and Distribution, Foodservice Sales, and Corporate. Skills information lives in different systems, spreadsheets, and people's heads.</w:t>
       </w:r>
     </w:p>
     <w:p>
@@ -951,7 +951,7 @@
                 <w:sz w:val="20"/>
                 <w:szCs w:val="20"/>
               </w:rPr>
-              <w:t xml:space="preserve">PLC and automation coverage is 34 percent today and needs to reach 65 percent before the new plant opens.</w:t>
+              <w:t xml:space="preserve">The 700,000 sq ft Asian-style food plant opens in 2027. PLC and automation coverage is 34 percent today and needs to reach 65 percent before then.</w:t>
             </w:r>
           </w:p>
         </w:tc>
@@ -1176,7 +1176,7 @@
           <w:sz w:val="21"/>
           <w:szCs w:val="21"/>
         </w:rPr>
-        <w:t xml:space="preserve">The made-up numbers are shaped by published figures rather than invented. Schwan's reports about 8,500 employees. Deloitte and The Manufacturing Institute put the manufacturing skills gap at 2.1 million unfilled jobs by 2030, with baby boomer retirement named by 34 percent of manufacturers as a leading cause. The average certified ammonia refrigeration technician in the US is approaching 55 years old, which is why this demo puts two retirement-eligible techs on the Marshall ammonia system. Every source is listed inside the app.</w:t>
+        <w:t xml:space="preserve">The made-up numbers are shaped by published figures rather than invented. Deloitte and The Manufacturing Institute put the manufacturing skills gap at 2.1 million unfilled jobs by 2030, with baby boomer retirement named by 34 percent of manufacturers as a leading cause. The IIAR reports that 40 percent of skilled trades workers are over 45 and nearly half of those are over 55, which is why this demo puts retirement-eligible techs on the Marshall ammonia system. The workforce size of about 8,500 is a stated assumption, since the company does not publish a headcount. Every claim, its source, and the three claims cut for weak sourcing are listed in the project's FACTS file and inside the app.</w:t>
       </w:r>
     </w:p>
     <w:p>

</xml_diff>

<commit_message>
publish the brief as markdown and pdf so it reads in the browser
</commit_message>
<xml_diff>
--- a/exports/Schwans_Project_Brief.docx
+++ b/exports/Schwans_Project_Brief.docx
@@ -40,7 +40,6 @@
           <w:szCs w:val="22"/>
         </w:rPr>
       </w:pPr>
-      <w:proofErr w:type="spellStart"/>
       <w:r>
         <w:rPr>
           <w:rFonts w:ascii="Calibri" w:hAnsi="Calibri" w:cs="Calibri"/>
@@ -51,7 +50,6 @@
         </w:rPr>
         <w:t>SkillSight</w:t>
       </w:r>
-      <w:proofErr w:type="spellEnd"/>
     </w:p>
     <w:p>
       <w:pPr>
@@ -384,79 +382,7 @@
           <w:sz w:val="22"/>
           <w:szCs w:val="22"/>
         </w:rPr>
-        <w:t xml:space="preserve">Organizations in food manufacturing face a measurable shortage of skilled technical </w:t>
-      </w:r>
-      <w:proofErr w:type="spellStart"/>
-      <w:r>
-        <w:rPr>
-          <w:rFonts w:ascii="Calibri" w:hAnsi="Calibri" w:cs="Calibri"/>
-          <w:sz w:val="22"/>
-          <w:szCs w:val="22"/>
-        </w:rPr>
-        <w:t>labour</w:t>
-      </w:r>
-      <w:proofErr w:type="spellEnd"/>
-      <w:r>
-        <w:rPr>
-          <w:rFonts w:ascii="Calibri" w:hAnsi="Calibri" w:cs="Calibri"/>
-          <w:sz w:val="22"/>
-          <w:szCs w:val="22"/>
-        </w:rPr>
-        <w:t xml:space="preserve">, an ageing trades workforce, and the operational risk created when critical knowledge is concentrated in very few employees. Existing enterprise systems record skills data but rarely rank it, leaving leaders with dashboards rather than decisions. This paper describes </w:t>
-      </w:r>
-      <w:proofErr w:type="spellStart"/>
-      <w:r>
-        <w:rPr>
-          <w:rFonts w:ascii="Calibri" w:hAnsi="Calibri" w:cs="Calibri"/>
-          <w:sz w:val="22"/>
-          <w:szCs w:val="22"/>
-        </w:rPr>
-        <w:t>SkillSight</w:t>
-      </w:r>
-      <w:proofErr w:type="spellEnd"/>
-      <w:r>
-        <w:rPr>
-          <w:rFonts w:ascii="Calibri" w:hAnsi="Calibri" w:cs="Calibri"/>
-          <w:sz w:val="22"/>
-          <w:szCs w:val="22"/>
-        </w:rPr>
-        <w:t xml:space="preserve">, a lightweight web application built during a 24-hour hackathon to answer the five questions posed in Schwan's Prompt 01. The tool inventories skills by job </w:t>
-      </w:r>
-      <w:proofErr w:type="gramStart"/>
-      <w:r>
-        <w:rPr>
-          <w:rFonts w:ascii="Calibri" w:hAnsi="Calibri" w:cs="Calibri"/>
-          <w:sz w:val="22"/>
-          <w:szCs w:val="22"/>
-        </w:rPr>
-        <w:t>group,</w:t>
-      </w:r>
-      <w:proofErr w:type="gramEnd"/>
-      <w:r>
-        <w:rPr>
-          <w:rFonts w:ascii="Calibri" w:hAnsi="Calibri" w:cs="Calibri"/>
-          <w:sz w:val="22"/>
-          <w:szCs w:val="22"/>
-        </w:rPr>
-        <w:t xml:space="preserve"> identifies coverage gaps, flags skills held by three people or fewer, projects future demand against business drivers, and attaches a first development step to each gap using the five methods named in the prompt. Its distinguishing feature is a prioritization score that multiplies business impact, holder scarcity, and gap size to produce a single ranked order of work. The application is implemented in four files of dependency-free HTML, CSS, and JavaScript, and is accompanied by a verification script that asserts 42 skill-and-list combinations across every rendered page. Demonstration data is simulated and labelled as such in the interface; organizational context is sourced and audited. The paper </w:t>
-      </w:r>
-      <w:proofErr w:type="gramStart"/>
-      <w:r>
-        <w:rPr>
-          <w:rFonts w:ascii="Calibri" w:hAnsi="Calibri" w:cs="Calibri"/>
-          <w:sz w:val="22"/>
-          <w:szCs w:val="22"/>
-        </w:rPr>
-        <w:t>reports</w:t>
-      </w:r>
-      <w:proofErr w:type="gramEnd"/>
-      <w:r>
-        <w:rPr>
-          <w:rFonts w:ascii="Calibri" w:hAnsi="Calibri" w:cs="Calibri"/>
-          <w:sz w:val="22"/>
-          <w:szCs w:val="22"/>
-        </w:rPr>
-        <w:t xml:space="preserve"> the design, the scoring model, the verification approach, and the limitations that separate a hackathon demonstration from a deployable system.</w:t>
+        <w:t>Organizations in food manufacturing face a measurable shortage of skilled technical labour, an ageing trades workforce, and the operational risk created when critical knowledge is concentrated in very few employees. Existing enterprise systems record skills data but rarely rank it, leaving leaders with dashboards rather than decisions. This paper describes SkillSight, a lightweight web application built during a 24-hour hackathon to answer the five questions posed in Schwan's Prompt 01. The tool inventories skills by job group, identifies coverage gaps, flags skills held by three people or fewer, projects future demand against business drivers, and attaches a first development step to each gap using the five methods named in the prompt. Its distinguishing feature is a prioritization score that multiplies business impact, holder scarcity, and gap size to produce a single ranked order of work. The application is implemented in four files of dependency-free HTML, CSS, and JavaScript, and is accompanied by a verification script that asserts 42 skill-and-list combinations across every rendered page. Demonstration data is simulated and labelled as such in the interface; organizational context is sourced and audited. The paper reports the design, the scoring model, the verification approach, and the limitations that separate a hackathon demonstration from a deployable system.</w:t>
       </w:r>
     </w:p>
     <w:p>
@@ -551,13 +477,10 @@
             <w:tabs>
               <w:tab w:val="right" w:leader="dot" w:pos="9350"/>
             </w:tabs>
-            <w:spacing w:after="0"/>
             <w:rPr>
-              <w:rFonts w:ascii="Calibri" w:eastAsiaTheme="minorEastAsia" w:hAnsi="Calibri" w:cs="Calibri"/>
+              <w:rFonts w:asciiTheme="minorHAnsi" w:eastAsiaTheme="minorEastAsia" w:hAnsiTheme="minorHAnsi" w:cstheme="minorBidi"/>
               <w:noProof/>
               <w:kern w:val="2"/>
-              <w:sz w:val="22"/>
-              <w:szCs w:val="22"/>
               <w14:ligatures w14:val="standardContextual"/>
             </w:rPr>
           </w:pPr>
@@ -585,76 +508,53 @@
             </w:rPr>
             <w:fldChar w:fldCharType="separate"/>
           </w:r>
-          <w:hyperlink w:anchor="_Toc240156114" w:history="1">
+          <w:hyperlink w:anchor="_Toc240158493" w:history="1">
             <w:r>
               <w:rPr>
                 <w:rStyle w:val="Hyperlink"/>
                 <w:rFonts w:ascii="Calibri" w:hAnsi="Calibri" w:cs="Calibri"/>
                 <w:noProof/>
-                <w:sz w:val="22"/>
-                <w:szCs w:val="22"/>
               </w:rPr>
               <w:t>Background</w:t>
             </w:r>
             <w:r>
               <w:rPr>
-                <w:rFonts w:ascii="Calibri" w:hAnsi="Calibri" w:cs="Calibri"/>
-                <w:noProof/>
-                <w:sz w:val="22"/>
-                <w:szCs w:val="22"/>
+                <w:noProof/>
               </w:rPr>
               <w:tab/>
             </w:r>
             <w:r>
               <w:rPr>
-                <w:rFonts w:ascii="Calibri" w:hAnsi="Calibri" w:cs="Calibri"/>
-                <w:noProof/>
-                <w:sz w:val="22"/>
-                <w:szCs w:val="22"/>
+                <w:noProof/>
               </w:rPr>
               <w:fldChar w:fldCharType="begin"/>
             </w:r>
             <w:r>
               <w:rPr>
-                <w:rFonts w:ascii="Calibri" w:hAnsi="Calibri" w:cs="Calibri"/>
-                <w:noProof/>
-                <w:sz w:val="22"/>
-                <w:szCs w:val="22"/>
-              </w:rPr>
-              <w:instrText xml:space="preserve"> PAGEREF _Toc240156114 \h </w:instrText>
-            </w:r>
-            <w:r>
-              <w:rPr>
-                <w:rFonts w:ascii="Calibri" w:hAnsi="Calibri" w:cs="Calibri"/>
-                <w:noProof/>
-                <w:sz w:val="22"/>
-                <w:szCs w:val="22"/>
-              </w:rPr>
-            </w:r>
-            <w:r>
-              <w:rPr>
-                <w:rFonts w:ascii="Calibri" w:hAnsi="Calibri" w:cs="Calibri"/>
-                <w:noProof/>
-                <w:sz w:val="22"/>
-                <w:szCs w:val="22"/>
+                <w:noProof/>
+              </w:rPr>
+              <w:instrText xml:space="preserve"> PAGEREF _Toc240158493 \h </w:instrText>
+            </w:r>
+            <w:r>
+              <w:rPr>
+                <w:noProof/>
+              </w:rPr>
+            </w:r>
+            <w:r>
+              <w:rPr>
+                <w:noProof/>
               </w:rPr>
               <w:fldChar w:fldCharType="separate"/>
             </w:r>
             <w:r>
               <w:rPr>
-                <w:rFonts w:ascii="Calibri" w:hAnsi="Calibri" w:cs="Calibri"/>
-                <w:noProof/>
-                <w:sz w:val="22"/>
-                <w:szCs w:val="22"/>
+                <w:noProof/>
               </w:rPr>
               <w:t>6</w:t>
             </w:r>
             <w:r>
               <w:rPr>
-                <w:rFonts w:ascii="Calibri" w:hAnsi="Calibri" w:cs="Calibri"/>
-                <w:noProof/>
-                <w:sz w:val="22"/>
-                <w:szCs w:val="22"/>
+                <w:noProof/>
               </w:rPr>
               <w:fldChar w:fldCharType="end"/>
             </w:r>
@@ -666,86 +566,60 @@
             <w:tabs>
               <w:tab w:val="right" w:leader="dot" w:pos="9350"/>
             </w:tabs>
-            <w:spacing w:after="0"/>
             <w:rPr>
-              <w:rFonts w:ascii="Calibri" w:eastAsiaTheme="minorEastAsia" w:hAnsi="Calibri" w:cs="Calibri"/>
+              <w:rFonts w:asciiTheme="minorHAnsi" w:eastAsiaTheme="minorEastAsia" w:hAnsiTheme="minorHAnsi" w:cstheme="minorBidi"/>
               <w:noProof/>
               <w:kern w:val="2"/>
-              <w:sz w:val="22"/>
-              <w:szCs w:val="22"/>
               <w14:ligatures w14:val="standardContextual"/>
             </w:rPr>
           </w:pPr>
-          <w:hyperlink w:anchor="_Toc240156115" w:history="1">
+          <w:hyperlink w:anchor="_Toc240158494" w:history="1">
             <w:r>
               <w:rPr>
                 <w:rStyle w:val="Hyperlink"/>
                 <w:rFonts w:ascii="Calibri" w:hAnsi="Calibri" w:cs="Calibri"/>
                 <w:noProof/>
-                <w:sz w:val="22"/>
-                <w:szCs w:val="22"/>
               </w:rPr>
               <w:t>The Skills Gap in United States Manufacturing</w:t>
             </w:r>
             <w:r>
               <w:rPr>
-                <w:rFonts w:ascii="Calibri" w:hAnsi="Calibri" w:cs="Calibri"/>
-                <w:noProof/>
-                <w:sz w:val="22"/>
-                <w:szCs w:val="22"/>
+                <w:noProof/>
               </w:rPr>
               <w:tab/>
             </w:r>
             <w:r>
               <w:rPr>
-                <w:rFonts w:ascii="Calibri" w:hAnsi="Calibri" w:cs="Calibri"/>
-                <w:noProof/>
-                <w:sz w:val="22"/>
-                <w:szCs w:val="22"/>
+                <w:noProof/>
               </w:rPr>
               <w:fldChar w:fldCharType="begin"/>
             </w:r>
             <w:r>
               <w:rPr>
-                <w:rFonts w:ascii="Calibri" w:hAnsi="Calibri" w:cs="Calibri"/>
-                <w:noProof/>
-                <w:sz w:val="22"/>
-                <w:szCs w:val="22"/>
-              </w:rPr>
-              <w:instrText xml:space="preserve"> PAGEREF _Toc240156115 \h </w:instrText>
-            </w:r>
-            <w:r>
-              <w:rPr>
-                <w:rFonts w:ascii="Calibri" w:hAnsi="Calibri" w:cs="Calibri"/>
-                <w:noProof/>
-                <w:sz w:val="22"/>
-                <w:szCs w:val="22"/>
-              </w:rPr>
-            </w:r>
-            <w:r>
-              <w:rPr>
-                <w:rFonts w:ascii="Calibri" w:hAnsi="Calibri" w:cs="Calibri"/>
-                <w:noProof/>
-                <w:sz w:val="22"/>
-                <w:szCs w:val="22"/>
+                <w:noProof/>
+              </w:rPr>
+              <w:instrText xml:space="preserve"> PAGEREF _Toc240158494 \h </w:instrText>
+            </w:r>
+            <w:r>
+              <w:rPr>
+                <w:noProof/>
+              </w:rPr>
+            </w:r>
+            <w:r>
+              <w:rPr>
+                <w:noProof/>
               </w:rPr>
               <w:fldChar w:fldCharType="separate"/>
             </w:r>
             <w:r>
               <w:rPr>
-                <w:rFonts w:ascii="Calibri" w:hAnsi="Calibri" w:cs="Calibri"/>
-                <w:noProof/>
-                <w:sz w:val="22"/>
-                <w:szCs w:val="22"/>
+                <w:noProof/>
               </w:rPr>
               <w:t>6</w:t>
             </w:r>
             <w:r>
               <w:rPr>
-                <w:rFonts w:ascii="Calibri" w:hAnsi="Calibri" w:cs="Calibri"/>
-                <w:noProof/>
-                <w:sz w:val="22"/>
-                <w:szCs w:val="22"/>
+                <w:noProof/>
               </w:rPr>
               <w:fldChar w:fldCharType="end"/>
             </w:r>
@@ -757,86 +631,60 @@
             <w:tabs>
               <w:tab w:val="right" w:leader="dot" w:pos="9350"/>
             </w:tabs>
-            <w:spacing w:after="0"/>
             <w:rPr>
-              <w:rFonts w:ascii="Calibri" w:eastAsiaTheme="minorEastAsia" w:hAnsi="Calibri" w:cs="Calibri"/>
+              <w:rFonts w:asciiTheme="minorHAnsi" w:eastAsiaTheme="minorEastAsia" w:hAnsiTheme="minorHAnsi" w:cstheme="minorBidi"/>
               <w:noProof/>
               <w:kern w:val="2"/>
-              <w:sz w:val="22"/>
-              <w:szCs w:val="22"/>
               <w14:ligatures w14:val="standardContextual"/>
             </w:rPr>
           </w:pPr>
-          <w:hyperlink w:anchor="_Toc240156116" w:history="1">
+          <w:hyperlink w:anchor="_Toc240158495" w:history="1">
             <w:r>
               <w:rPr>
                 <w:rStyle w:val="Hyperlink"/>
                 <w:rFonts w:ascii="Calibri" w:hAnsi="Calibri" w:cs="Calibri"/>
                 <w:noProof/>
-                <w:sz w:val="22"/>
-                <w:szCs w:val="22"/>
               </w:rPr>
               <w:t>Knowledge Concentration and an Ageing Trades Workforce</w:t>
             </w:r>
             <w:r>
               <w:rPr>
-                <w:rFonts w:ascii="Calibri" w:hAnsi="Calibri" w:cs="Calibri"/>
-                <w:noProof/>
-                <w:sz w:val="22"/>
-                <w:szCs w:val="22"/>
+                <w:noProof/>
               </w:rPr>
               <w:tab/>
             </w:r>
             <w:r>
               <w:rPr>
-                <w:rFonts w:ascii="Calibri" w:hAnsi="Calibri" w:cs="Calibri"/>
-                <w:noProof/>
-                <w:sz w:val="22"/>
-                <w:szCs w:val="22"/>
+                <w:noProof/>
               </w:rPr>
               <w:fldChar w:fldCharType="begin"/>
             </w:r>
             <w:r>
               <w:rPr>
-                <w:rFonts w:ascii="Calibri" w:hAnsi="Calibri" w:cs="Calibri"/>
-                <w:noProof/>
-                <w:sz w:val="22"/>
-                <w:szCs w:val="22"/>
-              </w:rPr>
-              <w:instrText xml:space="preserve"> PAGEREF _Toc240156116 \h </w:instrText>
-            </w:r>
-            <w:r>
-              <w:rPr>
-                <w:rFonts w:ascii="Calibri" w:hAnsi="Calibri" w:cs="Calibri"/>
-                <w:noProof/>
-                <w:sz w:val="22"/>
-                <w:szCs w:val="22"/>
-              </w:rPr>
-            </w:r>
-            <w:r>
-              <w:rPr>
-                <w:rFonts w:ascii="Calibri" w:hAnsi="Calibri" w:cs="Calibri"/>
-                <w:noProof/>
-                <w:sz w:val="22"/>
-                <w:szCs w:val="22"/>
+                <w:noProof/>
+              </w:rPr>
+              <w:instrText xml:space="preserve"> PAGEREF _Toc240158495 \h </w:instrText>
+            </w:r>
+            <w:r>
+              <w:rPr>
+                <w:noProof/>
+              </w:rPr>
+            </w:r>
+            <w:r>
+              <w:rPr>
+                <w:noProof/>
               </w:rPr>
               <w:fldChar w:fldCharType="separate"/>
             </w:r>
             <w:r>
               <w:rPr>
-                <w:rFonts w:ascii="Calibri" w:hAnsi="Calibri" w:cs="Calibri"/>
-                <w:noProof/>
-                <w:sz w:val="22"/>
-                <w:szCs w:val="22"/>
-              </w:rPr>
-              <w:t>7</w:t>
-            </w:r>
-            <w:r>
-              <w:rPr>
-                <w:rFonts w:ascii="Calibri" w:hAnsi="Calibri" w:cs="Calibri"/>
-                <w:noProof/>
-                <w:sz w:val="22"/>
-                <w:szCs w:val="22"/>
+                <w:noProof/>
+              </w:rPr>
+              <w:t>6</w:t>
+            </w:r>
+            <w:r>
+              <w:rPr>
+                <w:noProof/>
               </w:rPr>
               <w:fldChar w:fldCharType="end"/>
             </w:r>
@@ -848,86 +696,60 @@
             <w:tabs>
               <w:tab w:val="right" w:leader="dot" w:pos="9350"/>
             </w:tabs>
-            <w:spacing w:after="0"/>
             <w:rPr>
-              <w:rFonts w:ascii="Calibri" w:eastAsiaTheme="minorEastAsia" w:hAnsi="Calibri" w:cs="Calibri"/>
+              <w:rFonts w:asciiTheme="minorHAnsi" w:eastAsiaTheme="minorEastAsia" w:hAnsiTheme="minorHAnsi" w:cstheme="minorBidi"/>
               <w:noProof/>
               <w:kern w:val="2"/>
-              <w:sz w:val="22"/>
-              <w:szCs w:val="22"/>
               <w14:ligatures w14:val="standardContextual"/>
             </w:rPr>
           </w:pPr>
-          <w:hyperlink w:anchor="_Toc240156117" w:history="1">
+          <w:hyperlink w:anchor="_Toc240158496" w:history="1">
             <w:r>
               <w:rPr>
                 <w:rStyle w:val="Hyperlink"/>
                 <w:rFonts w:ascii="Calibri" w:hAnsi="Calibri" w:cs="Calibri"/>
                 <w:noProof/>
-                <w:sz w:val="22"/>
-                <w:szCs w:val="22"/>
               </w:rPr>
               <w:t>Where Skills Data Already Exists</w:t>
             </w:r>
             <w:r>
               <w:rPr>
-                <w:rFonts w:ascii="Calibri" w:hAnsi="Calibri" w:cs="Calibri"/>
-                <w:noProof/>
-                <w:sz w:val="22"/>
-                <w:szCs w:val="22"/>
+                <w:noProof/>
               </w:rPr>
               <w:tab/>
             </w:r>
             <w:r>
               <w:rPr>
-                <w:rFonts w:ascii="Calibri" w:hAnsi="Calibri" w:cs="Calibri"/>
-                <w:noProof/>
-                <w:sz w:val="22"/>
-                <w:szCs w:val="22"/>
+                <w:noProof/>
               </w:rPr>
               <w:fldChar w:fldCharType="begin"/>
             </w:r>
             <w:r>
               <w:rPr>
-                <w:rFonts w:ascii="Calibri" w:hAnsi="Calibri" w:cs="Calibri"/>
-                <w:noProof/>
-                <w:sz w:val="22"/>
-                <w:szCs w:val="22"/>
-              </w:rPr>
-              <w:instrText xml:space="preserve"> PAGEREF _Toc240156117 \h </w:instrText>
-            </w:r>
-            <w:r>
-              <w:rPr>
-                <w:rFonts w:ascii="Calibri" w:hAnsi="Calibri" w:cs="Calibri"/>
-                <w:noProof/>
-                <w:sz w:val="22"/>
-                <w:szCs w:val="22"/>
-              </w:rPr>
-            </w:r>
-            <w:r>
-              <w:rPr>
-                <w:rFonts w:ascii="Calibri" w:hAnsi="Calibri" w:cs="Calibri"/>
-                <w:noProof/>
-                <w:sz w:val="22"/>
-                <w:szCs w:val="22"/>
+                <w:noProof/>
+              </w:rPr>
+              <w:instrText xml:space="preserve"> PAGEREF _Toc240158496 \h </w:instrText>
+            </w:r>
+            <w:r>
+              <w:rPr>
+                <w:noProof/>
+              </w:rPr>
+            </w:r>
+            <w:r>
+              <w:rPr>
+                <w:noProof/>
               </w:rPr>
               <w:fldChar w:fldCharType="separate"/>
             </w:r>
             <w:r>
               <w:rPr>
-                <w:rFonts w:ascii="Calibri" w:hAnsi="Calibri" w:cs="Calibri"/>
-                <w:noProof/>
-                <w:sz w:val="22"/>
-                <w:szCs w:val="22"/>
-              </w:rPr>
-              <w:t>7</w:t>
-            </w:r>
-            <w:r>
-              <w:rPr>
-                <w:rFonts w:ascii="Calibri" w:hAnsi="Calibri" w:cs="Calibri"/>
-                <w:noProof/>
-                <w:sz w:val="22"/>
-                <w:szCs w:val="22"/>
+                <w:noProof/>
+              </w:rPr>
+              <w:t>6</w:t>
+            </w:r>
+            <w:r>
+              <w:rPr>
+                <w:noProof/>
               </w:rPr>
               <w:fldChar w:fldCharType="end"/>
             </w:r>
@@ -939,86 +761,60 @@
             <w:tabs>
               <w:tab w:val="right" w:leader="dot" w:pos="9350"/>
             </w:tabs>
-            <w:spacing w:after="0"/>
             <w:rPr>
-              <w:rFonts w:ascii="Calibri" w:eastAsiaTheme="minorEastAsia" w:hAnsi="Calibri" w:cs="Calibri"/>
+              <w:rFonts w:asciiTheme="minorHAnsi" w:eastAsiaTheme="minorEastAsia" w:hAnsiTheme="minorHAnsi" w:cstheme="minorBidi"/>
               <w:noProof/>
               <w:kern w:val="2"/>
-              <w:sz w:val="22"/>
-              <w:szCs w:val="22"/>
               <w14:ligatures w14:val="standardContextual"/>
             </w:rPr>
           </w:pPr>
-          <w:hyperlink w:anchor="_Toc240156118" w:history="1">
+          <w:hyperlink w:anchor="_Toc240158497" w:history="1">
             <w:r>
               <w:rPr>
                 <w:rStyle w:val="Hyperlink"/>
                 <w:rFonts w:ascii="Calibri" w:hAnsi="Calibri" w:cs="Calibri"/>
                 <w:noProof/>
-                <w:sz w:val="22"/>
-                <w:szCs w:val="22"/>
               </w:rPr>
               <w:t>Organizational Context</w:t>
             </w:r>
             <w:r>
               <w:rPr>
-                <w:rFonts w:ascii="Calibri" w:hAnsi="Calibri" w:cs="Calibri"/>
-                <w:noProof/>
-                <w:sz w:val="22"/>
-                <w:szCs w:val="22"/>
+                <w:noProof/>
               </w:rPr>
               <w:tab/>
             </w:r>
             <w:r>
               <w:rPr>
-                <w:rFonts w:ascii="Calibri" w:hAnsi="Calibri" w:cs="Calibri"/>
-                <w:noProof/>
-                <w:sz w:val="22"/>
-                <w:szCs w:val="22"/>
+                <w:noProof/>
               </w:rPr>
               <w:fldChar w:fldCharType="begin"/>
             </w:r>
             <w:r>
               <w:rPr>
-                <w:rFonts w:ascii="Calibri" w:hAnsi="Calibri" w:cs="Calibri"/>
-                <w:noProof/>
-                <w:sz w:val="22"/>
-                <w:szCs w:val="22"/>
-              </w:rPr>
-              <w:instrText xml:space="preserve"> PAGEREF _Toc240156118 \h </w:instrText>
-            </w:r>
-            <w:r>
-              <w:rPr>
-                <w:rFonts w:ascii="Calibri" w:hAnsi="Calibri" w:cs="Calibri"/>
-                <w:noProof/>
-                <w:sz w:val="22"/>
-                <w:szCs w:val="22"/>
-              </w:rPr>
-            </w:r>
-            <w:r>
-              <w:rPr>
-                <w:rFonts w:ascii="Calibri" w:hAnsi="Calibri" w:cs="Calibri"/>
-                <w:noProof/>
-                <w:sz w:val="22"/>
-                <w:szCs w:val="22"/>
+                <w:noProof/>
+              </w:rPr>
+              <w:instrText xml:space="preserve"> PAGEREF _Toc240158497 \h </w:instrText>
+            </w:r>
+            <w:r>
+              <w:rPr>
+                <w:noProof/>
+              </w:rPr>
+            </w:r>
+            <w:r>
+              <w:rPr>
+                <w:noProof/>
               </w:rPr>
               <w:fldChar w:fldCharType="separate"/>
             </w:r>
             <w:r>
               <w:rPr>
-                <w:rFonts w:ascii="Calibri" w:hAnsi="Calibri" w:cs="Calibri"/>
-                <w:noProof/>
-                <w:sz w:val="22"/>
-                <w:szCs w:val="22"/>
-              </w:rPr>
-              <w:t>8</w:t>
-            </w:r>
-            <w:r>
-              <w:rPr>
-                <w:rFonts w:ascii="Calibri" w:hAnsi="Calibri" w:cs="Calibri"/>
-                <w:noProof/>
-                <w:sz w:val="22"/>
-                <w:szCs w:val="22"/>
+                <w:noProof/>
+              </w:rPr>
+              <w:t>7</w:t>
+            </w:r>
+            <w:r>
+              <w:rPr>
+                <w:noProof/>
               </w:rPr>
               <w:fldChar w:fldCharType="end"/>
             </w:r>
@@ -1030,86 +826,60 @@
             <w:tabs>
               <w:tab w:val="right" w:leader="dot" w:pos="9350"/>
             </w:tabs>
-            <w:spacing w:after="0"/>
             <w:rPr>
-              <w:rFonts w:ascii="Calibri" w:eastAsiaTheme="minorEastAsia" w:hAnsi="Calibri" w:cs="Calibri"/>
+              <w:rFonts w:asciiTheme="minorHAnsi" w:eastAsiaTheme="minorEastAsia" w:hAnsiTheme="minorHAnsi" w:cstheme="minorBidi"/>
               <w:noProof/>
               <w:kern w:val="2"/>
-              <w:sz w:val="22"/>
-              <w:szCs w:val="22"/>
               <w14:ligatures w14:val="standardContextual"/>
             </w:rPr>
           </w:pPr>
-          <w:hyperlink w:anchor="_Toc240156119" w:history="1">
+          <w:hyperlink w:anchor="_Toc240158498" w:history="1">
             <w:r>
               <w:rPr>
                 <w:rStyle w:val="Hyperlink"/>
                 <w:rFonts w:ascii="Calibri" w:hAnsi="Calibri" w:cs="Calibri"/>
                 <w:noProof/>
-                <w:sz w:val="22"/>
-                <w:szCs w:val="22"/>
               </w:rPr>
               <w:t>Method</w:t>
             </w:r>
             <w:r>
               <w:rPr>
-                <w:rFonts w:ascii="Calibri" w:hAnsi="Calibri" w:cs="Calibri"/>
-                <w:noProof/>
-                <w:sz w:val="22"/>
-                <w:szCs w:val="22"/>
+                <w:noProof/>
               </w:rPr>
               <w:tab/>
             </w:r>
             <w:r>
               <w:rPr>
-                <w:rFonts w:ascii="Calibri" w:hAnsi="Calibri" w:cs="Calibri"/>
-                <w:noProof/>
-                <w:sz w:val="22"/>
-                <w:szCs w:val="22"/>
+                <w:noProof/>
               </w:rPr>
               <w:fldChar w:fldCharType="begin"/>
             </w:r>
             <w:r>
               <w:rPr>
-                <w:rFonts w:ascii="Calibri" w:hAnsi="Calibri" w:cs="Calibri"/>
-                <w:noProof/>
-                <w:sz w:val="22"/>
-                <w:szCs w:val="22"/>
-              </w:rPr>
-              <w:instrText xml:space="preserve"> PAGEREF _Toc240156119 \h </w:instrText>
-            </w:r>
-            <w:r>
-              <w:rPr>
-                <w:rFonts w:ascii="Calibri" w:hAnsi="Calibri" w:cs="Calibri"/>
-                <w:noProof/>
-                <w:sz w:val="22"/>
-                <w:szCs w:val="22"/>
-              </w:rPr>
-            </w:r>
-            <w:r>
-              <w:rPr>
-                <w:rFonts w:ascii="Calibri" w:hAnsi="Calibri" w:cs="Calibri"/>
-                <w:noProof/>
-                <w:sz w:val="22"/>
-                <w:szCs w:val="22"/>
+                <w:noProof/>
+              </w:rPr>
+              <w:instrText xml:space="preserve"> PAGEREF _Toc240158498 \h </w:instrText>
+            </w:r>
+            <w:r>
+              <w:rPr>
+                <w:noProof/>
+              </w:rPr>
+            </w:r>
+            <w:r>
+              <w:rPr>
+                <w:noProof/>
               </w:rPr>
               <w:fldChar w:fldCharType="separate"/>
             </w:r>
             <w:r>
               <w:rPr>
-                <w:rFonts w:ascii="Calibri" w:hAnsi="Calibri" w:cs="Calibri"/>
-                <w:noProof/>
-                <w:sz w:val="22"/>
-                <w:szCs w:val="22"/>
-              </w:rPr>
-              <w:t>9</w:t>
-            </w:r>
-            <w:r>
-              <w:rPr>
-                <w:rFonts w:ascii="Calibri" w:hAnsi="Calibri" w:cs="Calibri"/>
-                <w:noProof/>
-                <w:sz w:val="22"/>
-                <w:szCs w:val="22"/>
+                <w:noProof/>
+              </w:rPr>
+              <w:t>7</w:t>
+            </w:r>
+            <w:r>
+              <w:rPr>
+                <w:noProof/>
               </w:rPr>
               <w:fldChar w:fldCharType="end"/>
             </w:r>
@@ -1121,86 +891,60 @@
             <w:tabs>
               <w:tab w:val="right" w:leader="dot" w:pos="9350"/>
             </w:tabs>
-            <w:spacing w:after="0"/>
             <w:rPr>
-              <w:rFonts w:ascii="Calibri" w:eastAsiaTheme="minorEastAsia" w:hAnsi="Calibri" w:cs="Calibri"/>
+              <w:rFonts w:asciiTheme="minorHAnsi" w:eastAsiaTheme="minorEastAsia" w:hAnsiTheme="minorHAnsi" w:cstheme="minorBidi"/>
               <w:noProof/>
               <w:kern w:val="2"/>
-              <w:sz w:val="22"/>
-              <w:szCs w:val="22"/>
               <w14:ligatures w14:val="standardContextual"/>
             </w:rPr>
           </w:pPr>
-          <w:hyperlink w:anchor="_Toc240156120" w:history="1">
+          <w:hyperlink w:anchor="_Toc240158499" w:history="1">
             <w:r>
               <w:rPr>
                 <w:rStyle w:val="Hyperlink"/>
                 <w:rFonts w:ascii="Calibri" w:hAnsi="Calibri" w:cs="Calibri"/>
                 <w:noProof/>
-                <w:sz w:val="22"/>
-                <w:szCs w:val="22"/>
               </w:rPr>
               <w:t>Design Approach</w:t>
             </w:r>
             <w:r>
               <w:rPr>
-                <w:rFonts w:ascii="Calibri" w:hAnsi="Calibri" w:cs="Calibri"/>
-                <w:noProof/>
-                <w:sz w:val="22"/>
-                <w:szCs w:val="22"/>
+                <w:noProof/>
               </w:rPr>
               <w:tab/>
             </w:r>
             <w:r>
               <w:rPr>
-                <w:rFonts w:ascii="Calibri" w:hAnsi="Calibri" w:cs="Calibri"/>
-                <w:noProof/>
-                <w:sz w:val="22"/>
-                <w:szCs w:val="22"/>
+                <w:noProof/>
               </w:rPr>
               <w:fldChar w:fldCharType="begin"/>
             </w:r>
             <w:r>
               <w:rPr>
-                <w:rFonts w:ascii="Calibri" w:hAnsi="Calibri" w:cs="Calibri"/>
-                <w:noProof/>
-                <w:sz w:val="22"/>
-                <w:szCs w:val="22"/>
-              </w:rPr>
-              <w:instrText xml:space="preserve"> PAGEREF _Toc240156120 \h </w:instrText>
-            </w:r>
-            <w:r>
-              <w:rPr>
-                <w:rFonts w:ascii="Calibri" w:hAnsi="Calibri" w:cs="Calibri"/>
-                <w:noProof/>
-                <w:sz w:val="22"/>
-                <w:szCs w:val="22"/>
-              </w:rPr>
-            </w:r>
-            <w:r>
-              <w:rPr>
-                <w:rFonts w:ascii="Calibri" w:hAnsi="Calibri" w:cs="Calibri"/>
-                <w:noProof/>
-                <w:sz w:val="22"/>
-                <w:szCs w:val="22"/>
+                <w:noProof/>
+              </w:rPr>
+              <w:instrText xml:space="preserve"> PAGEREF _Toc240158499 \h </w:instrText>
+            </w:r>
+            <w:r>
+              <w:rPr>
+                <w:noProof/>
+              </w:rPr>
+            </w:r>
+            <w:r>
+              <w:rPr>
+                <w:noProof/>
               </w:rPr>
               <w:fldChar w:fldCharType="separate"/>
             </w:r>
             <w:r>
               <w:rPr>
-                <w:rFonts w:ascii="Calibri" w:hAnsi="Calibri" w:cs="Calibri"/>
-                <w:noProof/>
-                <w:sz w:val="22"/>
-                <w:szCs w:val="22"/>
-              </w:rPr>
-              <w:t>9</w:t>
-            </w:r>
-            <w:r>
-              <w:rPr>
-                <w:rFonts w:ascii="Calibri" w:hAnsi="Calibri" w:cs="Calibri"/>
-                <w:noProof/>
-                <w:sz w:val="22"/>
-                <w:szCs w:val="22"/>
+                <w:noProof/>
+              </w:rPr>
+              <w:t>7</w:t>
+            </w:r>
+            <w:r>
+              <w:rPr>
+                <w:noProof/>
               </w:rPr>
               <w:fldChar w:fldCharType="end"/>
             </w:r>
@@ -1212,86 +956,60 @@
             <w:tabs>
               <w:tab w:val="right" w:leader="dot" w:pos="9350"/>
             </w:tabs>
-            <w:spacing w:after="0"/>
             <w:rPr>
-              <w:rFonts w:ascii="Calibri" w:eastAsiaTheme="minorEastAsia" w:hAnsi="Calibri" w:cs="Calibri"/>
+              <w:rFonts w:asciiTheme="minorHAnsi" w:eastAsiaTheme="minorEastAsia" w:hAnsiTheme="minorHAnsi" w:cstheme="minorBidi"/>
               <w:noProof/>
               <w:kern w:val="2"/>
-              <w:sz w:val="22"/>
-              <w:szCs w:val="22"/>
               <w14:ligatures w14:val="standardContextual"/>
             </w:rPr>
           </w:pPr>
-          <w:hyperlink w:anchor="_Toc240156121" w:history="1">
+          <w:hyperlink w:anchor="_Toc240158500" w:history="1">
             <w:r>
               <w:rPr>
                 <w:rStyle w:val="Hyperlink"/>
                 <w:rFonts w:ascii="Calibri" w:hAnsi="Calibri" w:cs="Calibri"/>
                 <w:noProof/>
-                <w:sz w:val="22"/>
-                <w:szCs w:val="22"/>
               </w:rPr>
               <w:t>Data Model</w:t>
             </w:r>
             <w:r>
               <w:rPr>
-                <w:rFonts w:ascii="Calibri" w:hAnsi="Calibri" w:cs="Calibri"/>
-                <w:noProof/>
-                <w:sz w:val="22"/>
-                <w:szCs w:val="22"/>
+                <w:noProof/>
               </w:rPr>
               <w:tab/>
             </w:r>
             <w:r>
               <w:rPr>
-                <w:rFonts w:ascii="Calibri" w:hAnsi="Calibri" w:cs="Calibri"/>
-                <w:noProof/>
-                <w:sz w:val="22"/>
-                <w:szCs w:val="22"/>
+                <w:noProof/>
               </w:rPr>
               <w:fldChar w:fldCharType="begin"/>
             </w:r>
             <w:r>
               <w:rPr>
-                <w:rFonts w:ascii="Calibri" w:hAnsi="Calibri" w:cs="Calibri"/>
-                <w:noProof/>
-                <w:sz w:val="22"/>
-                <w:szCs w:val="22"/>
-              </w:rPr>
-              <w:instrText xml:space="preserve"> PAGEREF _Toc240156121 \h </w:instrText>
-            </w:r>
-            <w:r>
-              <w:rPr>
-                <w:rFonts w:ascii="Calibri" w:hAnsi="Calibri" w:cs="Calibri"/>
-                <w:noProof/>
-                <w:sz w:val="22"/>
-                <w:szCs w:val="22"/>
-              </w:rPr>
-            </w:r>
-            <w:r>
-              <w:rPr>
-                <w:rFonts w:ascii="Calibri" w:hAnsi="Calibri" w:cs="Calibri"/>
-                <w:noProof/>
-                <w:sz w:val="22"/>
-                <w:szCs w:val="22"/>
+                <w:noProof/>
+              </w:rPr>
+              <w:instrText xml:space="preserve"> PAGEREF _Toc240158500 \h </w:instrText>
+            </w:r>
+            <w:r>
+              <w:rPr>
+                <w:noProof/>
+              </w:rPr>
+            </w:r>
+            <w:r>
+              <w:rPr>
+                <w:noProof/>
               </w:rPr>
               <w:fldChar w:fldCharType="separate"/>
             </w:r>
             <w:r>
               <w:rPr>
-                <w:rFonts w:ascii="Calibri" w:hAnsi="Calibri" w:cs="Calibri"/>
-                <w:noProof/>
-                <w:sz w:val="22"/>
-                <w:szCs w:val="22"/>
-              </w:rPr>
-              <w:t>9</w:t>
-            </w:r>
-            <w:r>
-              <w:rPr>
-                <w:rFonts w:ascii="Calibri" w:hAnsi="Calibri" w:cs="Calibri"/>
-                <w:noProof/>
-                <w:sz w:val="22"/>
-                <w:szCs w:val="22"/>
+                <w:noProof/>
+              </w:rPr>
+              <w:t>8</w:t>
+            </w:r>
+            <w:r>
+              <w:rPr>
+                <w:noProof/>
               </w:rPr>
               <w:fldChar w:fldCharType="end"/>
             </w:r>
@@ -1303,86 +1021,60 @@
             <w:tabs>
               <w:tab w:val="right" w:leader="dot" w:pos="9350"/>
             </w:tabs>
-            <w:spacing w:after="0"/>
             <w:rPr>
-              <w:rFonts w:ascii="Calibri" w:eastAsiaTheme="minorEastAsia" w:hAnsi="Calibri" w:cs="Calibri"/>
+              <w:rFonts w:asciiTheme="minorHAnsi" w:eastAsiaTheme="minorEastAsia" w:hAnsiTheme="minorHAnsi" w:cstheme="minorBidi"/>
               <w:noProof/>
               <w:kern w:val="2"/>
-              <w:sz w:val="22"/>
-              <w:szCs w:val="22"/>
               <w14:ligatures w14:val="standardContextual"/>
             </w:rPr>
           </w:pPr>
-          <w:hyperlink w:anchor="_Toc240156122" w:history="1">
+          <w:hyperlink w:anchor="_Toc240158501" w:history="1">
             <w:r>
               <w:rPr>
                 <w:rStyle w:val="Hyperlink"/>
                 <w:rFonts w:ascii="Calibri" w:hAnsi="Calibri" w:cs="Calibri"/>
                 <w:noProof/>
-                <w:sz w:val="22"/>
-                <w:szCs w:val="22"/>
               </w:rPr>
               <w:t>Prioritization Score</w:t>
             </w:r>
             <w:r>
               <w:rPr>
-                <w:rFonts w:ascii="Calibri" w:hAnsi="Calibri" w:cs="Calibri"/>
-                <w:noProof/>
-                <w:sz w:val="22"/>
-                <w:szCs w:val="22"/>
+                <w:noProof/>
               </w:rPr>
               <w:tab/>
             </w:r>
             <w:r>
               <w:rPr>
-                <w:rFonts w:ascii="Calibri" w:hAnsi="Calibri" w:cs="Calibri"/>
-                <w:noProof/>
-                <w:sz w:val="22"/>
-                <w:szCs w:val="22"/>
+                <w:noProof/>
               </w:rPr>
               <w:fldChar w:fldCharType="begin"/>
             </w:r>
             <w:r>
               <w:rPr>
-                <w:rFonts w:ascii="Calibri" w:hAnsi="Calibri" w:cs="Calibri"/>
-                <w:noProof/>
-                <w:sz w:val="22"/>
-                <w:szCs w:val="22"/>
-              </w:rPr>
-              <w:instrText xml:space="preserve"> PAGEREF _Toc240156122 \h </w:instrText>
-            </w:r>
-            <w:r>
-              <w:rPr>
-                <w:rFonts w:ascii="Calibri" w:hAnsi="Calibri" w:cs="Calibri"/>
-                <w:noProof/>
-                <w:sz w:val="22"/>
-                <w:szCs w:val="22"/>
-              </w:rPr>
-            </w:r>
-            <w:r>
-              <w:rPr>
-                <w:rFonts w:ascii="Calibri" w:hAnsi="Calibri" w:cs="Calibri"/>
-                <w:noProof/>
-                <w:sz w:val="22"/>
-                <w:szCs w:val="22"/>
+                <w:noProof/>
+              </w:rPr>
+              <w:instrText xml:space="preserve"> PAGEREF _Toc240158501 \h </w:instrText>
+            </w:r>
+            <w:r>
+              <w:rPr>
+                <w:noProof/>
+              </w:rPr>
+            </w:r>
+            <w:r>
+              <w:rPr>
+                <w:noProof/>
               </w:rPr>
               <w:fldChar w:fldCharType="separate"/>
             </w:r>
             <w:r>
               <w:rPr>
-                <w:rFonts w:ascii="Calibri" w:hAnsi="Calibri" w:cs="Calibri"/>
-                <w:noProof/>
-                <w:sz w:val="22"/>
-                <w:szCs w:val="22"/>
-              </w:rPr>
-              <w:t>9</w:t>
-            </w:r>
-            <w:r>
-              <w:rPr>
-                <w:rFonts w:ascii="Calibri" w:hAnsi="Calibri" w:cs="Calibri"/>
-                <w:noProof/>
-                <w:sz w:val="22"/>
-                <w:szCs w:val="22"/>
+                <w:noProof/>
+              </w:rPr>
+              <w:t>8</w:t>
+            </w:r>
+            <w:r>
+              <w:rPr>
+                <w:noProof/>
               </w:rPr>
               <w:fldChar w:fldCharType="end"/>
             </w:r>
@@ -1394,86 +1086,60 @@
             <w:tabs>
               <w:tab w:val="right" w:leader="dot" w:pos="9350"/>
             </w:tabs>
-            <w:spacing w:after="0"/>
             <w:rPr>
-              <w:rFonts w:ascii="Calibri" w:eastAsiaTheme="minorEastAsia" w:hAnsi="Calibri" w:cs="Calibri"/>
+              <w:rFonts w:asciiTheme="minorHAnsi" w:eastAsiaTheme="minorEastAsia" w:hAnsiTheme="minorHAnsi" w:cstheme="minorBidi"/>
               <w:noProof/>
               <w:kern w:val="2"/>
-              <w:sz w:val="22"/>
-              <w:szCs w:val="22"/>
               <w14:ligatures w14:val="standardContextual"/>
             </w:rPr>
           </w:pPr>
-          <w:hyperlink w:anchor="_Toc240156123" w:history="1">
+          <w:hyperlink w:anchor="_Toc240158502" w:history="1">
             <w:r>
               <w:rPr>
                 <w:rStyle w:val="Hyperlink"/>
                 <w:rFonts w:ascii="Calibri" w:hAnsi="Calibri" w:cs="Calibri"/>
                 <w:noProof/>
-                <w:sz w:val="22"/>
-                <w:szCs w:val="22"/>
               </w:rPr>
               <w:t>Verification</w:t>
             </w:r>
             <w:r>
               <w:rPr>
-                <w:rFonts w:ascii="Calibri" w:hAnsi="Calibri" w:cs="Calibri"/>
-                <w:noProof/>
-                <w:sz w:val="22"/>
-                <w:szCs w:val="22"/>
+                <w:noProof/>
               </w:rPr>
               <w:tab/>
             </w:r>
             <w:r>
               <w:rPr>
-                <w:rFonts w:ascii="Calibri" w:hAnsi="Calibri" w:cs="Calibri"/>
-                <w:noProof/>
-                <w:sz w:val="22"/>
-                <w:szCs w:val="22"/>
+                <w:noProof/>
               </w:rPr>
               <w:fldChar w:fldCharType="begin"/>
             </w:r>
             <w:r>
               <w:rPr>
-                <w:rFonts w:ascii="Calibri" w:hAnsi="Calibri" w:cs="Calibri"/>
-                <w:noProof/>
-                <w:sz w:val="22"/>
-                <w:szCs w:val="22"/>
-              </w:rPr>
-              <w:instrText xml:space="preserve"> PAGEREF _Toc240156123 \h </w:instrText>
-            </w:r>
-            <w:r>
-              <w:rPr>
-                <w:rFonts w:ascii="Calibri" w:hAnsi="Calibri" w:cs="Calibri"/>
-                <w:noProof/>
-                <w:sz w:val="22"/>
-                <w:szCs w:val="22"/>
-              </w:rPr>
-            </w:r>
-            <w:r>
-              <w:rPr>
-                <w:rFonts w:ascii="Calibri" w:hAnsi="Calibri" w:cs="Calibri"/>
-                <w:noProof/>
-                <w:sz w:val="22"/>
-                <w:szCs w:val="22"/>
+                <w:noProof/>
+              </w:rPr>
+              <w:instrText xml:space="preserve"> PAGEREF _Toc240158502 \h </w:instrText>
+            </w:r>
+            <w:r>
+              <w:rPr>
+                <w:noProof/>
+              </w:rPr>
+            </w:r>
+            <w:r>
+              <w:rPr>
+                <w:noProof/>
               </w:rPr>
               <w:fldChar w:fldCharType="separate"/>
             </w:r>
             <w:r>
               <w:rPr>
-                <w:rFonts w:ascii="Calibri" w:hAnsi="Calibri" w:cs="Calibri"/>
-                <w:noProof/>
-                <w:sz w:val="22"/>
-                <w:szCs w:val="22"/>
-              </w:rPr>
-              <w:t>10</w:t>
-            </w:r>
-            <w:r>
-              <w:rPr>
-                <w:rFonts w:ascii="Calibri" w:hAnsi="Calibri" w:cs="Calibri"/>
-                <w:noProof/>
-                <w:sz w:val="22"/>
-                <w:szCs w:val="22"/>
+                <w:noProof/>
+              </w:rPr>
+              <w:t>8</w:t>
+            </w:r>
+            <w:r>
+              <w:rPr>
+                <w:noProof/>
               </w:rPr>
               <w:fldChar w:fldCharType="end"/>
             </w:r>
@@ -1485,86 +1151,60 @@
             <w:tabs>
               <w:tab w:val="right" w:leader="dot" w:pos="9350"/>
             </w:tabs>
-            <w:spacing w:after="0"/>
             <w:rPr>
-              <w:rFonts w:ascii="Calibri" w:eastAsiaTheme="minorEastAsia" w:hAnsi="Calibri" w:cs="Calibri"/>
+              <w:rFonts w:asciiTheme="minorHAnsi" w:eastAsiaTheme="minorEastAsia" w:hAnsiTheme="minorHAnsi" w:cstheme="minorBidi"/>
               <w:noProof/>
               <w:kern w:val="2"/>
-              <w:sz w:val="22"/>
-              <w:szCs w:val="22"/>
               <w14:ligatures w14:val="standardContextual"/>
             </w:rPr>
           </w:pPr>
-          <w:hyperlink w:anchor="_Toc240156124" w:history="1">
+          <w:hyperlink w:anchor="_Toc240158503" w:history="1">
             <w:r>
               <w:rPr>
                 <w:rStyle w:val="Hyperlink"/>
                 <w:rFonts w:ascii="Calibri" w:hAnsi="Calibri" w:cs="Calibri"/>
                 <w:noProof/>
-                <w:sz w:val="22"/>
-                <w:szCs w:val="22"/>
               </w:rPr>
               <w:t>Fact Verification Procedure</w:t>
             </w:r>
             <w:r>
               <w:rPr>
-                <w:rFonts w:ascii="Calibri" w:hAnsi="Calibri" w:cs="Calibri"/>
-                <w:noProof/>
-                <w:sz w:val="22"/>
-                <w:szCs w:val="22"/>
+                <w:noProof/>
               </w:rPr>
               <w:tab/>
             </w:r>
             <w:r>
               <w:rPr>
-                <w:rFonts w:ascii="Calibri" w:hAnsi="Calibri" w:cs="Calibri"/>
-                <w:noProof/>
-                <w:sz w:val="22"/>
-                <w:szCs w:val="22"/>
+                <w:noProof/>
               </w:rPr>
               <w:fldChar w:fldCharType="begin"/>
             </w:r>
             <w:r>
               <w:rPr>
-                <w:rFonts w:ascii="Calibri" w:hAnsi="Calibri" w:cs="Calibri"/>
-                <w:noProof/>
-                <w:sz w:val="22"/>
-                <w:szCs w:val="22"/>
-              </w:rPr>
-              <w:instrText xml:space="preserve"> PAGEREF _Toc240156124 \h </w:instrText>
-            </w:r>
-            <w:r>
-              <w:rPr>
-                <w:rFonts w:ascii="Calibri" w:hAnsi="Calibri" w:cs="Calibri"/>
-                <w:noProof/>
-                <w:sz w:val="22"/>
-                <w:szCs w:val="22"/>
-              </w:rPr>
-            </w:r>
-            <w:r>
-              <w:rPr>
-                <w:rFonts w:ascii="Calibri" w:hAnsi="Calibri" w:cs="Calibri"/>
-                <w:noProof/>
-                <w:sz w:val="22"/>
-                <w:szCs w:val="22"/>
+                <w:noProof/>
+              </w:rPr>
+              <w:instrText xml:space="preserve"> PAGEREF _Toc240158503 \h </w:instrText>
+            </w:r>
+            <w:r>
+              <w:rPr>
+                <w:noProof/>
+              </w:rPr>
+            </w:r>
+            <w:r>
+              <w:rPr>
+                <w:noProof/>
               </w:rPr>
               <w:fldChar w:fldCharType="separate"/>
             </w:r>
             <w:r>
               <w:rPr>
-                <w:rFonts w:ascii="Calibri" w:hAnsi="Calibri" w:cs="Calibri"/>
-                <w:noProof/>
-                <w:sz w:val="22"/>
-                <w:szCs w:val="22"/>
-              </w:rPr>
-              <w:t>10</w:t>
-            </w:r>
-            <w:r>
-              <w:rPr>
-                <w:rFonts w:ascii="Calibri" w:hAnsi="Calibri" w:cs="Calibri"/>
-                <w:noProof/>
-                <w:sz w:val="22"/>
-                <w:szCs w:val="22"/>
+                <w:noProof/>
+              </w:rPr>
+              <w:t>9</w:t>
+            </w:r>
+            <w:r>
+              <w:rPr>
+                <w:noProof/>
               </w:rPr>
               <w:fldChar w:fldCharType="end"/>
             </w:r>
@@ -1576,86 +1216,60 @@
             <w:tabs>
               <w:tab w:val="right" w:leader="dot" w:pos="9350"/>
             </w:tabs>
-            <w:spacing w:after="0"/>
             <w:rPr>
-              <w:rFonts w:ascii="Calibri" w:eastAsiaTheme="minorEastAsia" w:hAnsi="Calibri" w:cs="Calibri"/>
+              <w:rFonts w:asciiTheme="minorHAnsi" w:eastAsiaTheme="minorEastAsia" w:hAnsiTheme="minorHAnsi" w:cstheme="minorBidi"/>
               <w:noProof/>
               <w:kern w:val="2"/>
-              <w:sz w:val="22"/>
-              <w:szCs w:val="22"/>
               <w14:ligatures w14:val="standardContextual"/>
             </w:rPr>
           </w:pPr>
-          <w:hyperlink w:anchor="_Toc240156125" w:history="1">
+          <w:hyperlink w:anchor="_Toc240158504" w:history="1">
             <w:r>
               <w:rPr>
                 <w:rStyle w:val="Hyperlink"/>
                 <w:rFonts w:ascii="Calibri" w:hAnsi="Calibri" w:cs="Calibri"/>
                 <w:noProof/>
-                <w:sz w:val="22"/>
-                <w:szCs w:val="22"/>
               </w:rPr>
               <w:t>Results</w:t>
             </w:r>
             <w:r>
               <w:rPr>
-                <w:rFonts w:ascii="Calibri" w:hAnsi="Calibri" w:cs="Calibri"/>
-                <w:noProof/>
-                <w:sz w:val="22"/>
-                <w:szCs w:val="22"/>
+                <w:noProof/>
               </w:rPr>
               <w:tab/>
             </w:r>
             <w:r>
               <w:rPr>
-                <w:rFonts w:ascii="Calibri" w:hAnsi="Calibri" w:cs="Calibri"/>
-                <w:noProof/>
-                <w:sz w:val="22"/>
-                <w:szCs w:val="22"/>
+                <w:noProof/>
               </w:rPr>
               <w:fldChar w:fldCharType="begin"/>
             </w:r>
             <w:r>
               <w:rPr>
-                <w:rFonts w:ascii="Calibri" w:hAnsi="Calibri" w:cs="Calibri"/>
-                <w:noProof/>
-                <w:sz w:val="22"/>
-                <w:szCs w:val="22"/>
-              </w:rPr>
-              <w:instrText xml:space="preserve"> PAGEREF _Toc240156125 \h </w:instrText>
-            </w:r>
-            <w:r>
-              <w:rPr>
-                <w:rFonts w:ascii="Calibri" w:hAnsi="Calibri" w:cs="Calibri"/>
-                <w:noProof/>
-                <w:sz w:val="22"/>
-                <w:szCs w:val="22"/>
-              </w:rPr>
-            </w:r>
-            <w:r>
-              <w:rPr>
-                <w:rFonts w:ascii="Calibri" w:hAnsi="Calibri" w:cs="Calibri"/>
-                <w:noProof/>
-                <w:sz w:val="22"/>
-                <w:szCs w:val="22"/>
+                <w:noProof/>
+              </w:rPr>
+              <w:instrText xml:space="preserve"> PAGEREF _Toc240158504 \h </w:instrText>
+            </w:r>
+            <w:r>
+              <w:rPr>
+                <w:noProof/>
+              </w:rPr>
+            </w:r>
+            <w:r>
+              <w:rPr>
+                <w:noProof/>
               </w:rPr>
               <w:fldChar w:fldCharType="separate"/>
             </w:r>
             <w:r>
               <w:rPr>
-                <w:rFonts w:ascii="Calibri" w:hAnsi="Calibri" w:cs="Calibri"/>
-                <w:noProof/>
-                <w:sz w:val="22"/>
-                <w:szCs w:val="22"/>
-              </w:rPr>
-              <w:t>10</w:t>
-            </w:r>
-            <w:r>
-              <w:rPr>
-                <w:rFonts w:ascii="Calibri" w:hAnsi="Calibri" w:cs="Calibri"/>
-                <w:noProof/>
-                <w:sz w:val="22"/>
-                <w:szCs w:val="22"/>
+                <w:noProof/>
+              </w:rPr>
+              <w:t>9</w:t>
+            </w:r>
+            <w:r>
+              <w:rPr>
+                <w:noProof/>
               </w:rPr>
               <w:fldChar w:fldCharType="end"/>
             </w:r>
@@ -1667,86 +1281,60 @@
             <w:tabs>
               <w:tab w:val="right" w:leader="dot" w:pos="9350"/>
             </w:tabs>
-            <w:spacing w:after="0"/>
             <w:rPr>
-              <w:rFonts w:ascii="Calibri" w:eastAsiaTheme="minorEastAsia" w:hAnsi="Calibri" w:cs="Calibri"/>
+              <w:rFonts w:asciiTheme="minorHAnsi" w:eastAsiaTheme="minorEastAsia" w:hAnsiTheme="minorHAnsi" w:cstheme="minorBidi"/>
               <w:noProof/>
               <w:kern w:val="2"/>
-              <w:sz w:val="22"/>
-              <w:szCs w:val="22"/>
               <w14:ligatures w14:val="standardContextual"/>
             </w:rPr>
           </w:pPr>
-          <w:hyperlink w:anchor="_Toc240156126" w:history="1">
+          <w:hyperlink w:anchor="_Toc240158505" w:history="1">
             <w:r>
               <w:rPr>
                 <w:rStyle w:val="Hyperlink"/>
                 <w:rFonts w:ascii="Calibri" w:hAnsi="Calibri" w:cs="Calibri"/>
                 <w:noProof/>
-                <w:sz w:val="22"/>
-                <w:szCs w:val="22"/>
               </w:rPr>
               <w:t>Discussion</w:t>
             </w:r>
             <w:r>
               <w:rPr>
-                <w:rFonts w:ascii="Calibri" w:hAnsi="Calibri" w:cs="Calibri"/>
-                <w:noProof/>
-                <w:sz w:val="22"/>
-                <w:szCs w:val="22"/>
+                <w:noProof/>
               </w:rPr>
               <w:tab/>
             </w:r>
             <w:r>
               <w:rPr>
-                <w:rFonts w:ascii="Calibri" w:hAnsi="Calibri" w:cs="Calibri"/>
-                <w:noProof/>
-                <w:sz w:val="22"/>
-                <w:szCs w:val="22"/>
+                <w:noProof/>
               </w:rPr>
               <w:fldChar w:fldCharType="begin"/>
             </w:r>
             <w:r>
               <w:rPr>
-                <w:rFonts w:ascii="Calibri" w:hAnsi="Calibri" w:cs="Calibri"/>
-                <w:noProof/>
-                <w:sz w:val="22"/>
-                <w:szCs w:val="22"/>
-              </w:rPr>
-              <w:instrText xml:space="preserve"> PAGEREF _Toc240156126 \h </w:instrText>
-            </w:r>
-            <w:r>
-              <w:rPr>
-                <w:rFonts w:ascii="Calibri" w:hAnsi="Calibri" w:cs="Calibri"/>
-                <w:noProof/>
-                <w:sz w:val="22"/>
-                <w:szCs w:val="22"/>
-              </w:rPr>
-            </w:r>
-            <w:r>
-              <w:rPr>
-                <w:rFonts w:ascii="Calibri" w:hAnsi="Calibri" w:cs="Calibri"/>
-                <w:noProof/>
-                <w:sz w:val="22"/>
-                <w:szCs w:val="22"/>
+                <w:noProof/>
+              </w:rPr>
+              <w:instrText xml:space="preserve"> PAGEREF _Toc240158505 \h </w:instrText>
+            </w:r>
+            <w:r>
+              <w:rPr>
+                <w:noProof/>
+              </w:rPr>
+            </w:r>
+            <w:r>
+              <w:rPr>
+                <w:noProof/>
               </w:rPr>
               <w:fldChar w:fldCharType="separate"/>
             </w:r>
             <w:r>
               <w:rPr>
-                <w:rFonts w:ascii="Calibri" w:hAnsi="Calibri" w:cs="Calibri"/>
-                <w:noProof/>
-                <w:sz w:val="22"/>
-                <w:szCs w:val="22"/>
-              </w:rPr>
-              <w:t>13</w:t>
-            </w:r>
-            <w:r>
-              <w:rPr>
-                <w:rFonts w:ascii="Calibri" w:hAnsi="Calibri" w:cs="Calibri"/>
-                <w:noProof/>
-                <w:sz w:val="22"/>
-                <w:szCs w:val="22"/>
+                <w:noProof/>
+              </w:rPr>
+              <w:t>11</w:t>
+            </w:r>
+            <w:r>
+              <w:rPr>
+                <w:noProof/>
               </w:rPr>
               <w:fldChar w:fldCharType="end"/>
             </w:r>
@@ -1758,86 +1346,60 @@
             <w:tabs>
               <w:tab w:val="right" w:leader="dot" w:pos="9350"/>
             </w:tabs>
-            <w:spacing w:after="0"/>
             <w:rPr>
-              <w:rFonts w:ascii="Calibri" w:eastAsiaTheme="minorEastAsia" w:hAnsi="Calibri" w:cs="Calibri"/>
+              <w:rFonts w:asciiTheme="minorHAnsi" w:eastAsiaTheme="minorEastAsia" w:hAnsiTheme="minorHAnsi" w:cstheme="minorBidi"/>
               <w:noProof/>
               <w:kern w:val="2"/>
-              <w:sz w:val="22"/>
-              <w:szCs w:val="22"/>
               <w14:ligatures w14:val="standardContextual"/>
             </w:rPr>
           </w:pPr>
-          <w:hyperlink w:anchor="_Toc240156127" w:history="1">
+          <w:hyperlink w:anchor="_Toc240158506" w:history="1">
             <w:r>
               <w:rPr>
                 <w:rStyle w:val="Hyperlink"/>
                 <w:rFonts w:ascii="Calibri" w:hAnsi="Calibri" w:cs="Calibri"/>
                 <w:noProof/>
-                <w:sz w:val="22"/>
-                <w:szCs w:val="22"/>
               </w:rPr>
               <w:t>Interpretation</w:t>
             </w:r>
             <w:r>
               <w:rPr>
-                <w:rFonts w:ascii="Calibri" w:hAnsi="Calibri" w:cs="Calibri"/>
-                <w:noProof/>
-                <w:sz w:val="22"/>
-                <w:szCs w:val="22"/>
+                <w:noProof/>
               </w:rPr>
               <w:tab/>
             </w:r>
             <w:r>
               <w:rPr>
-                <w:rFonts w:ascii="Calibri" w:hAnsi="Calibri" w:cs="Calibri"/>
-                <w:noProof/>
-                <w:sz w:val="22"/>
-                <w:szCs w:val="22"/>
+                <w:noProof/>
               </w:rPr>
               <w:fldChar w:fldCharType="begin"/>
             </w:r>
             <w:r>
               <w:rPr>
-                <w:rFonts w:ascii="Calibri" w:hAnsi="Calibri" w:cs="Calibri"/>
-                <w:noProof/>
-                <w:sz w:val="22"/>
-                <w:szCs w:val="22"/>
-              </w:rPr>
-              <w:instrText xml:space="preserve"> PAGEREF _Toc240156127 \h </w:instrText>
-            </w:r>
-            <w:r>
-              <w:rPr>
-                <w:rFonts w:ascii="Calibri" w:hAnsi="Calibri" w:cs="Calibri"/>
-                <w:noProof/>
-                <w:sz w:val="22"/>
-                <w:szCs w:val="22"/>
-              </w:rPr>
-            </w:r>
-            <w:r>
-              <w:rPr>
-                <w:rFonts w:ascii="Calibri" w:hAnsi="Calibri" w:cs="Calibri"/>
-                <w:noProof/>
-                <w:sz w:val="22"/>
-                <w:szCs w:val="22"/>
+                <w:noProof/>
+              </w:rPr>
+              <w:instrText xml:space="preserve"> PAGEREF _Toc240158506 \h </w:instrText>
+            </w:r>
+            <w:r>
+              <w:rPr>
+                <w:noProof/>
+              </w:rPr>
+            </w:r>
+            <w:r>
+              <w:rPr>
+                <w:noProof/>
               </w:rPr>
               <w:fldChar w:fldCharType="separate"/>
             </w:r>
             <w:r>
               <w:rPr>
-                <w:rFonts w:ascii="Calibri" w:hAnsi="Calibri" w:cs="Calibri"/>
-                <w:noProof/>
-                <w:sz w:val="22"/>
-                <w:szCs w:val="22"/>
-              </w:rPr>
-              <w:t>13</w:t>
-            </w:r>
-            <w:r>
-              <w:rPr>
-                <w:rFonts w:ascii="Calibri" w:hAnsi="Calibri" w:cs="Calibri"/>
-                <w:noProof/>
-                <w:sz w:val="22"/>
-                <w:szCs w:val="22"/>
+                <w:noProof/>
+              </w:rPr>
+              <w:t>11</w:t>
+            </w:r>
+            <w:r>
+              <w:rPr>
+                <w:noProof/>
               </w:rPr>
               <w:fldChar w:fldCharType="end"/>
             </w:r>
@@ -1849,86 +1411,60 @@
             <w:tabs>
               <w:tab w:val="right" w:leader="dot" w:pos="9350"/>
             </w:tabs>
-            <w:spacing w:after="0"/>
             <w:rPr>
-              <w:rFonts w:ascii="Calibri" w:eastAsiaTheme="minorEastAsia" w:hAnsi="Calibri" w:cs="Calibri"/>
+              <w:rFonts w:asciiTheme="minorHAnsi" w:eastAsiaTheme="minorEastAsia" w:hAnsiTheme="minorHAnsi" w:cstheme="minorBidi"/>
               <w:noProof/>
               <w:kern w:val="2"/>
-              <w:sz w:val="22"/>
-              <w:szCs w:val="22"/>
               <w14:ligatures w14:val="standardContextual"/>
             </w:rPr>
           </w:pPr>
-          <w:hyperlink w:anchor="_Toc240156128" w:history="1">
+          <w:hyperlink w:anchor="_Toc240158507" w:history="1">
             <w:r>
               <w:rPr>
                 <w:rStyle w:val="Hyperlink"/>
                 <w:rFonts w:ascii="Calibri" w:hAnsi="Calibri" w:cs="Calibri"/>
                 <w:noProof/>
-                <w:sz w:val="22"/>
-                <w:szCs w:val="22"/>
               </w:rPr>
               <w:t>Limitations</w:t>
             </w:r>
             <w:r>
               <w:rPr>
-                <w:rFonts w:ascii="Calibri" w:hAnsi="Calibri" w:cs="Calibri"/>
-                <w:noProof/>
-                <w:sz w:val="22"/>
-                <w:szCs w:val="22"/>
+                <w:noProof/>
               </w:rPr>
               <w:tab/>
             </w:r>
             <w:r>
               <w:rPr>
-                <w:rFonts w:ascii="Calibri" w:hAnsi="Calibri" w:cs="Calibri"/>
-                <w:noProof/>
-                <w:sz w:val="22"/>
-                <w:szCs w:val="22"/>
+                <w:noProof/>
               </w:rPr>
               <w:fldChar w:fldCharType="begin"/>
             </w:r>
             <w:r>
               <w:rPr>
-                <w:rFonts w:ascii="Calibri" w:hAnsi="Calibri" w:cs="Calibri"/>
-                <w:noProof/>
-                <w:sz w:val="22"/>
-                <w:szCs w:val="22"/>
-              </w:rPr>
-              <w:instrText xml:space="preserve"> PAGEREF _Toc240156128 \h </w:instrText>
-            </w:r>
-            <w:r>
-              <w:rPr>
-                <w:rFonts w:ascii="Calibri" w:hAnsi="Calibri" w:cs="Calibri"/>
-                <w:noProof/>
-                <w:sz w:val="22"/>
-                <w:szCs w:val="22"/>
-              </w:rPr>
-            </w:r>
-            <w:r>
-              <w:rPr>
-                <w:rFonts w:ascii="Calibri" w:hAnsi="Calibri" w:cs="Calibri"/>
-                <w:noProof/>
-                <w:sz w:val="22"/>
-                <w:szCs w:val="22"/>
+                <w:noProof/>
+              </w:rPr>
+              <w:instrText xml:space="preserve"> PAGEREF _Toc240158507 \h </w:instrText>
+            </w:r>
+            <w:r>
+              <w:rPr>
+                <w:noProof/>
+              </w:rPr>
+            </w:r>
+            <w:r>
+              <w:rPr>
+                <w:noProof/>
               </w:rPr>
               <w:fldChar w:fldCharType="separate"/>
             </w:r>
             <w:r>
               <w:rPr>
-                <w:rFonts w:ascii="Calibri" w:hAnsi="Calibri" w:cs="Calibri"/>
-                <w:noProof/>
-                <w:sz w:val="22"/>
-                <w:szCs w:val="22"/>
-              </w:rPr>
-              <w:t>13</w:t>
-            </w:r>
-            <w:r>
-              <w:rPr>
-                <w:rFonts w:ascii="Calibri" w:hAnsi="Calibri" w:cs="Calibri"/>
-                <w:noProof/>
-                <w:sz w:val="22"/>
-                <w:szCs w:val="22"/>
+                <w:noProof/>
+              </w:rPr>
+              <w:t>12</w:t>
+            </w:r>
+            <w:r>
+              <w:rPr>
+                <w:noProof/>
               </w:rPr>
               <w:fldChar w:fldCharType="end"/>
             </w:r>
@@ -1940,86 +1476,60 @@
             <w:tabs>
               <w:tab w:val="right" w:leader="dot" w:pos="9350"/>
             </w:tabs>
-            <w:spacing w:after="0"/>
             <w:rPr>
-              <w:rFonts w:ascii="Calibri" w:eastAsiaTheme="minorEastAsia" w:hAnsi="Calibri" w:cs="Calibri"/>
+              <w:rFonts w:asciiTheme="minorHAnsi" w:eastAsiaTheme="minorEastAsia" w:hAnsiTheme="minorHAnsi" w:cstheme="minorBidi"/>
               <w:noProof/>
               <w:kern w:val="2"/>
-              <w:sz w:val="22"/>
-              <w:szCs w:val="22"/>
               <w14:ligatures w14:val="standardContextual"/>
             </w:rPr>
           </w:pPr>
-          <w:hyperlink w:anchor="_Toc240156129" w:history="1">
+          <w:hyperlink w:anchor="_Toc240158508" w:history="1">
             <w:r>
               <w:rPr>
                 <w:rStyle w:val="Hyperlink"/>
                 <w:rFonts w:ascii="Calibri" w:hAnsi="Calibri" w:cs="Calibri"/>
                 <w:noProof/>
-                <w:sz w:val="22"/>
-                <w:szCs w:val="22"/>
               </w:rPr>
               <w:t>Ethical Considerations</w:t>
             </w:r>
             <w:r>
               <w:rPr>
-                <w:rFonts w:ascii="Calibri" w:hAnsi="Calibri" w:cs="Calibri"/>
-                <w:noProof/>
-                <w:sz w:val="22"/>
-                <w:szCs w:val="22"/>
+                <w:noProof/>
               </w:rPr>
               <w:tab/>
             </w:r>
             <w:r>
               <w:rPr>
-                <w:rFonts w:ascii="Calibri" w:hAnsi="Calibri" w:cs="Calibri"/>
-                <w:noProof/>
-                <w:sz w:val="22"/>
-                <w:szCs w:val="22"/>
+                <w:noProof/>
               </w:rPr>
               <w:fldChar w:fldCharType="begin"/>
             </w:r>
             <w:r>
               <w:rPr>
-                <w:rFonts w:ascii="Calibri" w:hAnsi="Calibri" w:cs="Calibri"/>
-                <w:noProof/>
-                <w:sz w:val="22"/>
-                <w:szCs w:val="22"/>
-              </w:rPr>
-              <w:instrText xml:space="preserve"> PAGEREF _Toc240156129 \h </w:instrText>
-            </w:r>
-            <w:r>
-              <w:rPr>
-                <w:rFonts w:ascii="Calibri" w:hAnsi="Calibri" w:cs="Calibri"/>
-                <w:noProof/>
-                <w:sz w:val="22"/>
-                <w:szCs w:val="22"/>
-              </w:rPr>
-            </w:r>
-            <w:r>
-              <w:rPr>
-                <w:rFonts w:ascii="Calibri" w:hAnsi="Calibri" w:cs="Calibri"/>
-                <w:noProof/>
-                <w:sz w:val="22"/>
-                <w:szCs w:val="22"/>
+                <w:noProof/>
+              </w:rPr>
+              <w:instrText xml:space="preserve"> PAGEREF _Toc240158508 \h </w:instrText>
+            </w:r>
+            <w:r>
+              <w:rPr>
+                <w:noProof/>
+              </w:rPr>
+            </w:r>
+            <w:r>
+              <w:rPr>
+                <w:noProof/>
               </w:rPr>
               <w:fldChar w:fldCharType="separate"/>
             </w:r>
             <w:r>
               <w:rPr>
-                <w:rFonts w:ascii="Calibri" w:hAnsi="Calibri" w:cs="Calibri"/>
-                <w:noProof/>
-                <w:sz w:val="22"/>
-                <w:szCs w:val="22"/>
-              </w:rPr>
-              <w:t>13</w:t>
-            </w:r>
-            <w:r>
-              <w:rPr>
-                <w:rFonts w:ascii="Calibri" w:hAnsi="Calibri" w:cs="Calibri"/>
-                <w:noProof/>
-                <w:sz w:val="22"/>
-                <w:szCs w:val="22"/>
+                <w:noProof/>
+              </w:rPr>
+              <w:t>12</w:t>
+            </w:r>
+            <w:r>
+              <w:rPr>
+                <w:noProof/>
               </w:rPr>
               <w:fldChar w:fldCharType="end"/>
             </w:r>
@@ -2031,86 +1541,60 @@
             <w:tabs>
               <w:tab w:val="right" w:leader="dot" w:pos="9350"/>
             </w:tabs>
-            <w:spacing w:after="0"/>
             <w:rPr>
-              <w:rFonts w:ascii="Calibri" w:eastAsiaTheme="minorEastAsia" w:hAnsi="Calibri" w:cs="Calibri"/>
+              <w:rFonts w:asciiTheme="minorHAnsi" w:eastAsiaTheme="minorEastAsia" w:hAnsiTheme="minorHAnsi" w:cstheme="minorBidi"/>
               <w:noProof/>
               <w:kern w:val="2"/>
-              <w:sz w:val="22"/>
-              <w:szCs w:val="22"/>
               <w14:ligatures w14:val="standardContextual"/>
             </w:rPr>
           </w:pPr>
-          <w:hyperlink w:anchor="_Toc240156130" w:history="1">
+          <w:hyperlink w:anchor="_Toc240158509" w:history="1">
             <w:r>
               <w:rPr>
                 <w:rStyle w:val="Hyperlink"/>
                 <w:rFonts w:ascii="Calibri" w:hAnsi="Calibri" w:cs="Calibri"/>
                 <w:noProof/>
-                <w:sz w:val="22"/>
-                <w:szCs w:val="22"/>
               </w:rPr>
               <w:t>Future Work</w:t>
             </w:r>
             <w:r>
               <w:rPr>
-                <w:rFonts w:ascii="Calibri" w:hAnsi="Calibri" w:cs="Calibri"/>
-                <w:noProof/>
-                <w:sz w:val="22"/>
-                <w:szCs w:val="22"/>
+                <w:noProof/>
               </w:rPr>
               <w:tab/>
             </w:r>
             <w:r>
               <w:rPr>
-                <w:rFonts w:ascii="Calibri" w:hAnsi="Calibri" w:cs="Calibri"/>
-                <w:noProof/>
-                <w:sz w:val="22"/>
-                <w:szCs w:val="22"/>
+                <w:noProof/>
               </w:rPr>
               <w:fldChar w:fldCharType="begin"/>
             </w:r>
             <w:r>
               <w:rPr>
-                <w:rFonts w:ascii="Calibri" w:hAnsi="Calibri" w:cs="Calibri"/>
-                <w:noProof/>
-                <w:sz w:val="22"/>
-                <w:szCs w:val="22"/>
-              </w:rPr>
-              <w:instrText xml:space="preserve"> PAGEREF _Toc240156130 \h </w:instrText>
-            </w:r>
-            <w:r>
-              <w:rPr>
-                <w:rFonts w:ascii="Calibri" w:hAnsi="Calibri" w:cs="Calibri"/>
-                <w:noProof/>
-                <w:sz w:val="22"/>
-                <w:szCs w:val="22"/>
-              </w:rPr>
-            </w:r>
-            <w:r>
-              <w:rPr>
-                <w:rFonts w:ascii="Calibri" w:hAnsi="Calibri" w:cs="Calibri"/>
-                <w:noProof/>
-                <w:sz w:val="22"/>
-                <w:szCs w:val="22"/>
+                <w:noProof/>
+              </w:rPr>
+              <w:instrText xml:space="preserve"> PAGEREF _Toc240158509 \h </w:instrText>
+            </w:r>
+            <w:r>
+              <w:rPr>
+                <w:noProof/>
+              </w:rPr>
+            </w:r>
+            <w:r>
+              <w:rPr>
+                <w:noProof/>
               </w:rPr>
               <w:fldChar w:fldCharType="separate"/>
             </w:r>
             <w:r>
               <w:rPr>
-                <w:rFonts w:ascii="Calibri" w:hAnsi="Calibri" w:cs="Calibri"/>
-                <w:noProof/>
-                <w:sz w:val="22"/>
-                <w:szCs w:val="22"/>
-              </w:rPr>
-              <w:t>14</w:t>
-            </w:r>
-            <w:r>
-              <w:rPr>
-                <w:rFonts w:ascii="Calibri" w:hAnsi="Calibri" w:cs="Calibri"/>
-                <w:noProof/>
-                <w:sz w:val="22"/>
-                <w:szCs w:val="22"/>
+                <w:noProof/>
+              </w:rPr>
+              <w:t>12</w:t>
+            </w:r>
+            <w:r>
+              <w:rPr>
+                <w:noProof/>
               </w:rPr>
               <w:fldChar w:fldCharType="end"/>
             </w:r>
@@ -2122,86 +1606,60 @@
             <w:tabs>
               <w:tab w:val="right" w:leader="dot" w:pos="9350"/>
             </w:tabs>
-            <w:spacing w:after="0"/>
             <w:rPr>
-              <w:rFonts w:ascii="Calibri" w:eastAsiaTheme="minorEastAsia" w:hAnsi="Calibri" w:cs="Calibri"/>
+              <w:rFonts w:asciiTheme="minorHAnsi" w:eastAsiaTheme="minorEastAsia" w:hAnsiTheme="minorHAnsi" w:cstheme="minorBidi"/>
               <w:noProof/>
               <w:kern w:val="2"/>
-              <w:sz w:val="22"/>
-              <w:szCs w:val="22"/>
               <w14:ligatures w14:val="standardContextual"/>
             </w:rPr>
           </w:pPr>
-          <w:hyperlink w:anchor="_Toc240156131" w:history="1">
+          <w:hyperlink w:anchor="_Toc240158510" w:history="1">
             <w:r>
               <w:rPr>
                 <w:rStyle w:val="Hyperlink"/>
                 <w:rFonts w:ascii="Calibri" w:hAnsi="Calibri" w:cs="Calibri"/>
                 <w:noProof/>
-                <w:sz w:val="22"/>
-                <w:szCs w:val="22"/>
               </w:rPr>
               <w:t>Conclusion</w:t>
             </w:r>
             <w:r>
               <w:rPr>
-                <w:rFonts w:ascii="Calibri" w:hAnsi="Calibri" w:cs="Calibri"/>
-                <w:noProof/>
-                <w:sz w:val="22"/>
-                <w:szCs w:val="22"/>
+                <w:noProof/>
               </w:rPr>
               <w:tab/>
             </w:r>
             <w:r>
               <w:rPr>
-                <w:rFonts w:ascii="Calibri" w:hAnsi="Calibri" w:cs="Calibri"/>
-                <w:noProof/>
-                <w:sz w:val="22"/>
-                <w:szCs w:val="22"/>
+                <w:noProof/>
               </w:rPr>
               <w:fldChar w:fldCharType="begin"/>
             </w:r>
             <w:r>
               <w:rPr>
-                <w:rFonts w:ascii="Calibri" w:hAnsi="Calibri" w:cs="Calibri"/>
-                <w:noProof/>
-                <w:sz w:val="22"/>
-                <w:szCs w:val="22"/>
-              </w:rPr>
-              <w:instrText xml:space="preserve"> PAGEREF _Toc240156131 \h </w:instrText>
-            </w:r>
-            <w:r>
-              <w:rPr>
-                <w:rFonts w:ascii="Calibri" w:hAnsi="Calibri" w:cs="Calibri"/>
-                <w:noProof/>
-                <w:sz w:val="22"/>
-                <w:szCs w:val="22"/>
-              </w:rPr>
-            </w:r>
-            <w:r>
-              <w:rPr>
-                <w:rFonts w:ascii="Calibri" w:hAnsi="Calibri" w:cs="Calibri"/>
-                <w:noProof/>
-                <w:sz w:val="22"/>
-                <w:szCs w:val="22"/>
+                <w:noProof/>
+              </w:rPr>
+              <w:instrText xml:space="preserve"> PAGEREF _Toc240158510 \h </w:instrText>
+            </w:r>
+            <w:r>
+              <w:rPr>
+                <w:noProof/>
+              </w:rPr>
+            </w:r>
+            <w:r>
+              <w:rPr>
+                <w:noProof/>
               </w:rPr>
               <w:fldChar w:fldCharType="separate"/>
             </w:r>
             <w:r>
               <w:rPr>
-                <w:rFonts w:ascii="Calibri" w:hAnsi="Calibri" w:cs="Calibri"/>
-                <w:noProof/>
-                <w:sz w:val="22"/>
-                <w:szCs w:val="22"/>
+                <w:noProof/>
               </w:rPr>
               <w:t>14</w:t>
             </w:r>
             <w:r>
               <w:rPr>
-                <w:rFonts w:ascii="Calibri" w:hAnsi="Calibri" w:cs="Calibri"/>
-                <w:noProof/>
-                <w:sz w:val="22"/>
-                <w:szCs w:val="22"/>
+                <w:noProof/>
               </w:rPr>
               <w:fldChar w:fldCharType="end"/>
             </w:r>
@@ -2213,86 +1671,60 @@
             <w:tabs>
               <w:tab w:val="right" w:leader="dot" w:pos="9350"/>
             </w:tabs>
-            <w:spacing w:after="0"/>
             <w:rPr>
-              <w:rFonts w:ascii="Calibri" w:eastAsiaTheme="minorEastAsia" w:hAnsi="Calibri" w:cs="Calibri"/>
+              <w:rFonts w:asciiTheme="minorHAnsi" w:eastAsiaTheme="minorEastAsia" w:hAnsiTheme="minorHAnsi" w:cstheme="minorBidi"/>
               <w:noProof/>
               <w:kern w:val="2"/>
-              <w:sz w:val="22"/>
-              <w:szCs w:val="22"/>
               <w14:ligatures w14:val="standardContextual"/>
             </w:rPr>
           </w:pPr>
-          <w:hyperlink w:anchor="_Toc240156132" w:history="1">
+          <w:hyperlink w:anchor="_Toc240158511" w:history="1">
             <w:r>
               <w:rPr>
                 <w:rStyle w:val="Hyperlink"/>
                 <w:rFonts w:ascii="Calibri" w:hAnsi="Calibri" w:cs="Calibri"/>
                 <w:noProof/>
-                <w:sz w:val="22"/>
-                <w:szCs w:val="22"/>
               </w:rPr>
               <w:t>Appendix A</w:t>
             </w:r>
             <w:r>
               <w:rPr>
-                <w:rFonts w:ascii="Calibri" w:hAnsi="Calibri" w:cs="Calibri"/>
-                <w:noProof/>
-                <w:sz w:val="22"/>
-                <w:szCs w:val="22"/>
+                <w:noProof/>
               </w:rPr>
               <w:tab/>
             </w:r>
             <w:r>
               <w:rPr>
-                <w:rFonts w:ascii="Calibri" w:hAnsi="Calibri" w:cs="Calibri"/>
-                <w:noProof/>
-                <w:sz w:val="22"/>
-                <w:szCs w:val="22"/>
+                <w:noProof/>
               </w:rPr>
               <w:fldChar w:fldCharType="begin"/>
             </w:r>
             <w:r>
               <w:rPr>
-                <w:rFonts w:ascii="Calibri" w:hAnsi="Calibri" w:cs="Calibri"/>
-                <w:noProof/>
-                <w:sz w:val="22"/>
-                <w:szCs w:val="22"/>
-              </w:rPr>
-              <w:instrText xml:space="preserve"> PAGEREF _Toc240156132 \h </w:instrText>
-            </w:r>
-            <w:r>
-              <w:rPr>
-                <w:rFonts w:ascii="Calibri" w:hAnsi="Calibri" w:cs="Calibri"/>
-                <w:noProof/>
-                <w:sz w:val="22"/>
-                <w:szCs w:val="22"/>
-              </w:rPr>
-            </w:r>
-            <w:r>
-              <w:rPr>
-                <w:rFonts w:ascii="Calibri" w:hAnsi="Calibri" w:cs="Calibri"/>
-                <w:noProof/>
-                <w:sz w:val="22"/>
-                <w:szCs w:val="22"/>
+                <w:noProof/>
+              </w:rPr>
+              <w:instrText xml:space="preserve"> PAGEREF _Toc240158511 \h </w:instrText>
+            </w:r>
+            <w:r>
+              <w:rPr>
+                <w:noProof/>
+              </w:rPr>
+            </w:r>
+            <w:r>
+              <w:rPr>
+                <w:noProof/>
               </w:rPr>
               <w:fldChar w:fldCharType="separate"/>
             </w:r>
             <w:r>
               <w:rPr>
-                <w:rFonts w:ascii="Calibri" w:hAnsi="Calibri" w:cs="Calibri"/>
-                <w:noProof/>
-                <w:sz w:val="22"/>
-                <w:szCs w:val="22"/>
-              </w:rPr>
-              <w:t>18</w:t>
-            </w:r>
-            <w:r>
-              <w:rPr>
-                <w:rFonts w:ascii="Calibri" w:hAnsi="Calibri" w:cs="Calibri"/>
-                <w:noProof/>
-                <w:sz w:val="22"/>
-                <w:szCs w:val="22"/>
+                <w:noProof/>
+              </w:rPr>
+              <w:t>17</w:t>
+            </w:r>
+            <w:r>
+              <w:rPr>
+                <w:noProof/>
               </w:rPr>
               <w:fldChar w:fldCharType="end"/>
             </w:r>
@@ -2304,86 +1736,60 @@
             <w:tabs>
               <w:tab w:val="right" w:leader="dot" w:pos="9350"/>
             </w:tabs>
-            <w:spacing w:after="0"/>
             <w:rPr>
-              <w:rFonts w:ascii="Calibri" w:eastAsiaTheme="minorEastAsia" w:hAnsi="Calibri" w:cs="Calibri"/>
+              <w:rFonts w:asciiTheme="minorHAnsi" w:eastAsiaTheme="minorEastAsia" w:hAnsiTheme="minorHAnsi" w:cstheme="minorBidi"/>
               <w:noProof/>
               <w:kern w:val="2"/>
-              <w:sz w:val="22"/>
-              <w:szCs w:val="22"/>
               <w14:ligatures w14:val="standardContextual"/>
             </w:rPr>
           </w:pPr>
-          <w:hyperlink w:anchor="_Toc240156133" w:history="1">
+          <w:hyperlink w:anchor="_Toc240158512" w:history="1">
             <w:r>
               <w:rPr>
                 <w:rStyle w:val="Hyperlink"/>
                 <w:rFonts w:ascii="Calibri" w:hAnsi="Calibri" w:cs="Calibri"/>
                 <w:noProof/>
-                <w:sz w:val="22"/>
-                <w:szCs w:val="22"/>
               </w:rPr>
               <w:t>Appendix B</w:t>
             </w:r>
             <w:r>
               <w:rPr>
-                <w:rFonts w:ascii="Calibri" w:hAnsi="Calibri" w:cs="Calibri"/>
-                <w:noProof/>
-                <w:sz w:val="22"/>
-                <w:szCs w:val="22"/>
+                <w:noProof/>
               </w:rPr>
               <w:tab/>
             </w:r>
             <w:r>
               <w:rPr>
-                <w:rFonts w:ascii="Calibri" w:hAnsi="Calibri" w:cs="Calibri"/>
-                <w:noProof/>
-                <w:sz w:val="22"/>
-                <w:szCs w:val="22"/>
+                <w:noProof/>
               </w:rPr>
               <w:fldChar w:fldCharType="begin"/>
             </w:r>
             <w:r>
               <w:rPr>
-                <w:rFonts w:ascii="Calibri" w:hAnsi="Calibri" w:cs="Calibri"/>
-                <w:noProof/>
-                <w:sz w:val="22"/>
-                <w:szCs w:val="22"/>
-              </w:rPr>
-              <w:instrText xml:space="preserve"> PAGEREF _Toc240156133 \h </w:instrText>
-            </w:r>
-            <w:r>
-              <w:rPr>
-                <w:rFonts w:ascii="Calibri" w:hAnsi="Calibri" w:cs="Calibri"/>
-                <w:noProof/>
-                <w:sz w:val="22"/>
-                <w:szCs w:val="22"/>
-              </w:rPr>
-            </w:r>
-            <w:r>
-              <w:rPr>
-                <w:rFonts w:ascii="Calibri" w:hAnsi="Calibri" w:cs="Calibri"/>
-                <w:noProof/>
-                <w:sz w:val="22"/>
-                <w:szCs w:val="22"/>
+                <w:noProof/>
+              </w:rPr>
+              <w:instrText xml:space="preserve"> PAGEREF _Toc240158512 \h </w:instrText>
+            </w:r>
+            <w:r>
+              <w:rPr>
+                <w:noProof/>
+              </w:rPr>
+            </w:r>
+            <w:r>
+              <w:rPr>
+                <w:noProof/>
               </w:rPr>
               <w:fldChar w:fldCharType="separate"/>
             </w:r>
             <w:r>
               <w:rPr>
-                <w:rFonts w:ascii="Calibri" w:hAnsi="Calibri" w:cs="Calibri"/>
-                <w:noProof/>
-                <w:sz w:val="22"/>
-                <w:szCs w:val="22"/>
-              </w:rPr>
-              <w:t>19</w:t>
-            </w:r>
-            <w:r>
-              <w:rPr>
-                <w:rFonts w:ascii="Calibri" w:hAnsi="Calibri" w:cs="Calibri"/>
-                <w:noProof/>
-                <w:sz w:val="22"/>
-                <w:szCs w:val="22"/>
+                <w:noProof/>
+              </w:rPr>
+              <w:t>18</w:t>
+            </w:r>
+            <w:r>
+              <w:rPr>
+                <w:noProof/>
               </w:rPr>
               <w:fldChar w:fldCharType="end"/>
             </w:r>
@@ -2395,86 +1801,60 @@
             <w:tabs>
               <w:tab w:val="right" w:leader="dot" w:pos="9350"/>
             </w:tabs>
-            <w:spacing w:after="0"/>
             <w:rPr>
-              <w:rFonts w:ascii="Calibri" w:eastAsiaTheme="minorEastAsia" w:hAnsi="Calibri" w:cs="Calibri"/>
+              <w:rFonts w:asciiTheme="minorHAnsi" w:eastAsiaTheme="minorEastAsia" w:hAnsiTheme="minorHAnsi" w:cstheme="minorBidi"/>
               <w:noProof/>
               <w:kern w:val="2"/>
-              <w:sz w:val="22"/>
-              <w:szCs w:val="22"/>
               <w14:ligatures w14:val="standardContextual"/>
             </w:rPr>
           </w:pPr>
-          <w:hyperlink w:anchor="_Toc240156134" w:history="1">
+          <w:hyperlink w:anchor="_Toc240158513" w:history="1">
             <w:r>
               <w:rPr>
                 <w:rStyle w:val="Hyperlink"/>
                 <w:rFonts w:ascii="Calibri" w:hAnsi="Calibri" w:cs="Calibri"/>
                 <w:noProof/>
-                <w:sz w:val="22"/>
-                <w:szCs w:val="22"/>
               </w:rPr>
               <w:t>Appendix C</w:t>
             </w:r>
             <w:r>
               <w:rPr>
-                <w:rFonts w:ascii="Calibri" w:hAnsi="Calibri" w:cs="Calibri"/>
-                <w:noProof/>
-                <w:sz w:val="22"/>
-                <w:szCs w:val="22"/>
+                <w:noProof/>
               </w:rPr>
               <w:tab/>
             </w:r>
             <w:r>
               <w:rPr>
-                <w:rFonts w:ascii="Calibri" w:hAnsi="Calibri" w:cs="Calibri"/>
-                <w:noProof/>
-                <w:sz w:val="22"/>
-                <w:szCs w:val="22"/>
+                <w:noProof/>
               </w:rPr>
               <w:fldChar w:fldCharType="begin"/>
             </w:r>
             <w:r>
               <w:rPr>
-                <w:rFonts w:ascii="Calibri" w:hAnsi="Calibri" w:cs="Calibri"/>
-                <w:noProof/>
-                <w:sz w:val="22"/>
-                <w:szCs w:val="22"/>
-              </w:rPr>
-              <w:instrText xml:space="preserve"> PAGEREF _Toc240156134 \h </w:instrText>
-            </w:r>
-            <w:r>
-              <w:rPr>
-                <w:rFonts w:ascii="Calibri" w:hAnsi="Calibri" w:cs="Calibri"/>
-                <w:noProof/>
-                <w:sz w:val="22"/>
-                <w:szCs w:val="22"/>
-              </w:rPr>
-            </w:r>
-            <w:r>
-              <w:rPr>
-                <w:rFonts w:ascii="Calibri" w:hAnsi="Calibri" w:cs="Calibri"/>
-                <w:noProof/>
-                <w:sz w:val="22"/>
-                <w:szCs w:val="22"/>
+                <w:noProof/>
+              </w:rPr>
+              <w:instrText xml:space="preserve"> PAGEREF _Toc240158513 \h </w:instrText>
+            </w:r>
+            <w:r>
+              <w:rPr>
+                <w:noProof/>
+              </w:rPr>
+            </w:r>
+            <w:r>
+              <w:rPr>
+                <w:noProof/>
               </w:rPr>
               <w:fldChar w:fldCharType="separate"/>
             </w:r>
             <w:r>
               <w:rPr>
-                <w:rFonts w:ascii="Calibri" w:hAnsi="Calibri" w:cs="Calibri"/>
-                <w:noProof/>
-                <w:sz w:val="22"/>
-                <w:szCs w:val="22"/>
-              </w:rPr>
-              <w:t>20</w:t>
-            </w:r>
-            <w:r>
-              <w:rPr>
-                <w:rFonts w:ascii="Calibri" w:hAnsi="Calibri" w:cs="Calibri"/>
-                <w:noProof/>
-                <w:sz w:val="22"/>
-                <w:szCs w:val="22"/>
+                <w:noProof/>
+              </w:rPr>
+              <w:t>19</w:t>
+            </w:r>
+            <w:r>
+              <w:rPr>
+                <w:noProof/>
               </w:rPr>
               <w:fldChar w:fldCharType="end"/>
             </w:r>
@@ -2486,86 +1866,60 @@
             <w:tabs>
               <w:tab w:val="right" w:leader="dot" w:pos="9350"/>
             </w:tabs>
-            <w:spacing w:after="0"/>
             <w:rPr>
-              <w:rFonts w:ascii="Calibri" w:eastAsiaTheme="minorEastAsia" w:hAnsi="Calibri" w:cs="Calibri"/>
+              <w:rFonts w:asciiTheme="minorHAnsi" w:eastAsiaTheme="minorEastAsia" w:hAnsiTheme="minorHAnsi" w:cstheme="minorBidi"/>
               <w:noProof/>
               <w:kern w:val="2"/>
-              <w:sz w:val="22"/>
-              <w:szCs w:val="22"/>
               <w14:ligatures w14:val="standardContextual"/>
             </w:rPr>
           </w:pPr>
-          <w:hyperlink w:anchor="_Toc240156135" w:history="1">
+          <w:hyperlink w:anchor="_Toc240158514" w:history="1">
             <w:r>
               <w:rPr>
                 <w:rStyle w:val="Hyperlink"/>
                 <w:rFonts w:ascii="Calibri" w:hAnsi="Calibri" w:cs="Calibri"/>
                 <w:noProof/>
-                <w:sz w:val="22"/>
-                <w:szCs w:val="22"/>
               </w:rPr>
               <w:t>Appendix D</w:t>
             </w:r>
             <w:r>
               <w:rPr>
-                <w:rFonts w:ascii="Calibri" w:hAnsi="Calibri" w:cs="Calibri"/>
-                <w:noProof/>
-                <w:sz w:val="22"/>
-                <w:szCs w:val="22"/>
+                <w:noProof/>
               </w:rPr>
               <w:tab/>
             </w:r>
             <w:r>
               <w:rPr>
-                <w:rFonts w:ascii="Calibri" w:hAnsi="Calibri" w:cs="Calibri"/>
-                <w:noProof/>
-                <w:sz w:val="22"/>
-                <w:szCs w:val="22"/>
+                <w:noProof/>
               </w:rPr>
               <w:fldChar w:fldCharType="begin"/>
             </w:r>
             <w:r>
               <w:rPr>
-                <w:rFonts w:ascii="Calibri" w:hAnsi="Calibri" w:cs="Calibri"/>
-                <w:noProof/>
-                <w:sz w:val="22"/>
-                <w:szCs w:val="22"/>
-              </w:rPr>
-              <w:instrText xml:space="preserve"> PAGEREF _Toc240156135 \h </w:instrText>
-            </w:r>
-            <w:r>
-              <w:rPr>
-                <w:rFonts w:ascii="Calibri" w:hAnsi="Calibri" w:cs="Calibri"/>
-                <w:noProof/>
-                <w:sz w:val="22"/>
-                <w:szCs w:val="22"/>
-              </w:rPr>
-            </w:r>
-            <w:r>
-              <w:rPr>
-                <w:rFonts w:ascii="Calibri" w:hAnsi="Calibri" w:cs="Calibri"/>
-                <w:noProof/>
-                <w:sz w:val="22"/>
-                <w:szCs w:val="22"/>
+                <w:noProof/>
+              </w:rPr>
+              <w:instrText xml:space="preserve"> PAGEREF _Toc240158514 \h </w:instrText>
+            </w:r>
+            <w:r>
+              <w:rPr>
+                <w:noProof/>
+              </w:rPr>
+            </w:r>
+            <w:r>
+              <w:rPr>
+                <w:noProof/>
               </w:rPr>
               <w:fldChar w:fldCharType="separate"/>
             </w:r>
             <w:r>
               <w:rPr>
-                <w:rFonts w:ascii="Calibri" w:hAnsi="Calibri" w:cs="Calibri"/>
-                <w:noProof/>
-                <w:sz w:val="22"/>
-                <w:szCs w:val="22"/>
-              </w:rPr>
-              <w:t>21</w:t>
-            </w:r>
-            <w:r>
-              <w:rPr>
-                <w:rFonts w:ascii="Calibri" w:hAnsi="Calibri" w:cs="Calibri"/>
-                <w:noProof/>
-                <w:sz w:val="22"/>
-                <w:szCs w:val="22"/>
+                <w:noProof/>
+              </w:rPr>
+              <w:t>20</w:t>
+            </w:r>
+            <w:r>
+              <w:rPr>
+                <w:noProof/>
               </w:rPr>
               <w:fldChar w:fldCharType="end"/>
             </w:r>
@@ -2599,7 +1953,6 @@
           <w:szCs w:val="22"/>
         </w:rPr>
       </w:pPr>
-      <w:proofErr w:type="spellStart"/>
       <w:r>
         <w:rPr>
           <w:rFonts w:ascii="Calibri" w:hAnsi="Calibri" w:cs="Calibri"/>
@@ -2608,9 +1961,18 @@
           <w:sz w:val="22"/>
           <w:szCs w:val="22"/>
         </w:rPr>
-        <w:t>SkillSight</w:t>
-      </w:r>
-      <w:proofErr w:type="spellEnd"/>
+        <w:t>SkillSight: A Lightweight Skills Intelligence Tool for Identifying</w:t>
+      </w:r>
+    </w:p>
+    <w:p>
+      <w:pPr>
+        <w:jc w:val="center"/>
+        <w:rPr>
+          <w:rFonts w:ascii="Calibri" w:hAnsi="Calibri" w:cs="Calibri"/>
+          <w:sz w:val="22"/>
+          <w:szCs w:val="22"/>
+        </w:rPr>
+      </w:pPr>
       <w:r>
         <w:rPr>
           <w:rFonts w:ascii="Calibri" w:hAnsi="Calibri" w:cs="Calibri"/>
@@ -2619,26 +1981,6 @@
           <w:sz w:val="22"/>
           <w:szCs w:val="22"/>
         </w:rPr>
-        <w:t>: A Lightweight Skills Intelligence Tool for Identifying</w:t>
-      </w:r>
-    </w:p>
-    <w:p>
-      <w:pPr>
-        <w:jc w:val="center"/>
-        <w:rPr>
-          <w:rFonts w:ascii="Calibri" w:hAnsi="Calibri" w:cs="Calibri"/>
-          <w:sz w:val="22"/>
-          <w:szCs w:val="22"/>
-        </w:rPr>
-      </w:pPr>
-      <w:r>
-        <w:rPr>
-          <w:rFonts w:ascii="Calibri" w:hAnsi="Calibri" w:cs="Calibri"/>
-          <w:b/>
-          <w:bCs/>
-          <w:sz w:val="22"/>
-          <w:szCs w:val="22"/>
-        </w:rPr>
         <w:t>Knowledge Concentration Risk in Food Manufacturing</w:t>
       </w:r>
     </w:p>
@@ -2657,25 +1999,7 @@
           <w:sz w:val="22"/>
           <w:szCs w:val="22"/>
         </w:rPr>
-        <w:t xml:space="preserve">Leaders of large manufacturing organizations are routinely asked to plan for capability they cannot see. Skills information is dispersed across human resources systems, plant training files, certification registries, and the working memory of long-tenured employees. The consequence is not merely administrative. When a critical skill is held by one or two people at a single site, the organization carries an operational risk that no one has </w:t>
-      </w:r>
-      <w:proofErr w:type="gramStart"/>
-      <w:r>
-        <w:rPr>
-          <w:rFonts w:ascii="Calibri" w:hAnsi="Calibri" w:cs="Calibri"/>
-          <w:sz w:val="22"/>
-          <w:szCs w:val="22"/>
-        </w:rPr>
-        <w:t>quantified</w:t>
-      </w:r>
-      <w:proofErr w:type="gramEnd"/>
-      <w:r>
-        <w:rPr>
-          <w:rFonts w:ascii="Calibri" w:hAnsi="Calibri" w:cs="Calibri"/>
-          <w:sz w:val="22"/>
-          <w:szCs w:val="22"/>
-        </w:rPr>
-        <w:t xml:space="preserve"> and no one owns.</w:t>
+        <w:t>Leaders of large manufacturing organizations are routinely asked to plan for capability they cannot see. Skills information is dispersed across human resources systems, plant training files, certification registries, and the working memory of long-tenured employees. The consequence is not merely administrative. When a critical skill is held by one or two people at a single site, the organization carries an operational risk that no one has quantified and no one owns.</w:t>
       </w:r>
     </w:p>
     <w:p>
@@ -2693,43 +2017,7 @@
           <w:sz w:val="22"/>
           <w:szCs w:val="22"/>
         </w:rPr>
-        <w:t xml:space="preserve">Schwan's Prompt 01 at Southwest MN Hacks 2026 framed this problem directly, asking entrants to build a solution that helps an organization understand current workforce capability, identify critical gaps, assess future talent needs, and accelerate readiness through targeted development recommendations. The </w:t>
-      </w:r>
-      <w:proofErr w:type="gramStart"/>
-      <w:r>
-        <w:rPr>
-          <w:rFonts w:ascii="Calibri" w:hAnsi="Calibri" w:cs="Calibri"/>
-          <w:sz w:val="22"/>
-          <w:szCs w:val="22"/>
-        </w:rPr>
-        <w:t>prompt</w:t>
-      </w:r>
-      <w:proofErr w:type="gramEnd"/>
-      <w:r>
-        <w:rPr>
-          <w:rFonts w:ascii="Calibri" w:hAnsi="Calibri" w:cs="Calibri"/>
-          <w:sz w:val="22"/>
-          <w:szCs w:val="22"/>
-        </w:rPr>
-        <w:t xml:space="preserve"> specified five questions the platform should </w:t>
-      </w:r>
-      <w:proofErr w:type="gramStart"/>
-      <w:r>
-        <w:rPr>
-          <w:rFonts w:ascii="Calibri" w:hAnsi="Calibri" w:cs="Calibri"/>
-          <w:sz w:val="22"/>
-          <w:szCs w:val="22"/>
-        </w:rPr>
-        <w:t>answer,</w:t>
-      </w:r>
-      <w:proofErr w:type="gramEnd"/>
-      <w:r>
-        <w:rPr>
-          <w:rFonts w:ascii="Calibri" w:hAnsi="Calibri" w:cs="Calibri"/>
-          <w:sz w:val="22"/>
-          <w:szCs w:val="22"/>
-        </w:rPr>
-        <w:t xml:space="preserve"> concerning skills that exist today, skills that will be needed, skills concentrated in a few individuals, the greatest capability gaps and succession risks, and the ways employees can close those gaps.</w:t>
+        <w:t>Schwan's Prompt 01 at Southwest MN Hacks 2026 framed this problem directly, asking entrants to build a solution that helps an organization understand current workforce capability, identify critical gaps, assess future talent needs, and accelerate readiness through targeted development recommendations. The prompt specified five questions the platform should answer, concerning skills that exist today, skills that will be needed, skills concentrated in a few individuals, the greatest capability gaps and succession risks, and the ways employees can close those gaps.</w:t>
       </w:r>
     </w:p>
     <w:p>
@@ -2747,43 +2035,7 @@
           <w:sz w:val="22"/>
           <w:szCs w:val="22"/>
         </w:rPr>
-        <w:t xml:space="preserve">This paper describes </w:t>
-      </w:r>
-      <w:proofErr w:type="spellStart"/>
-      <w:r>
-        <w:rPr>
-          <w:rFonts w:ascii="Calibri" w:hAnsi="Calibri" w:cs="Calibri"/>
-          <w:sz w:val="22"/>
-          <w:szCs w:val="22"/>
-        </w:rPr>
-        <w:t>SkillSight</w:t>
-      </w:r>
-      <w:proofErr w:type="spellEnd"/>
-      <w:r>
-        <w:rPr>
-          <w:rFonts w:ascii="Calibri" w:hAnsi="Calibri" w:cs="Calibri"/>
-          <w:sz w:val="22"/>
-          <w:szCs w:val="22"/>
-        </w:rPr>
-        <w:t xml:space="preserve">, the application built in </w:t>
-      </w:r>
-      <w:proofErr w:type="gramStart"/>
-      <w:r>
-        <w:rPr>
-          <w:rFonts w:ascii="Calibri" w:hAnsi="Calibri" w:cs="Calibri"/>
-          <w:sz w:val="22"/>
-          <w:szCs w:val="22"/>
-        </w:rPr>
-        <w:t>response, and</w:t>
-      </w:r>
-      <w:proofErr w:type="gramEnd"/>
-      <w:r>
-        <w:rPr>
-          <w:rFonts w:ascii="Calibri" w:hAnsi="Calibri" w:cs="Calibri"/>
-          <w:sz w:val="22"/>
-          <w:szCs w:val="22"/>
-        </w:rPr>
-        <w:t xml:space="preserve"> argues a narrow thesis: in a domain where enterprise systems already collect skills data, the scarce capability is not visualization but prioritization. The contribution of the tool is therefore a defensible ranking, expressed in a formula that is displayed to the user rather than hidden, together with an honest account of which numbers are real and which are simulated.</w:t>
+        <w:t>This paper describes SkillSight, the application built in response, and argues a narrow thesis: in a domain where enterprise systems already collect skills data, the scarce capability is not visualization but prioritization. The contribution of the tool is therefore a defensible ranking, expressed in a formula that is displayed to the user rather than hidden, together with an honest account of which numbers are real and which are simulated.</w:t>
       </w:r>
     </w:p>
     <w:p>
@@ -2795,7 +2047,7 @@
           <w:szCs w:val="22"/>
         </w:rPr>
       </w:pPr>
-      <w:bookmarkStart w:id="0" w:name="_Toc240156114"/>
+      <w:bookmarkStart w:id="0" w:name="_Toc240158493"/>
       <w:r>
         <w:rPr>
           <w:rFonts w:ascii="Calibri" w:hAnsi="Calibri" w:cs="Calibri"/>
@@ -2815,7 +2067,7 @@
           <w:szCs w:val="22"/>
         </w:rPr>
       </w:pPr>
-      <w:bookmarkStart w:id="1" w:name="_Toc240156115"/>
+      <w:bookmarkStart w:id="1" w:name="_Toc240158494"/>
       <w:r>
         <w:rPr>
           <w:rFonts w:ascii="Calibri" w:hAnsi="Calibri" w:cs="Calibri"/>
@@ -2853,7 +2105,7 @@
           <w:szCs w:val="22"/>
         </w:rPr>
       </w:pPr>
-      <w:bookmarkStart w:id="2" w:name="_Toc240156116"/>
+      <w:bookmarkStart w:id="2" w:name="_Toc240158495"/>
       <w:r>
         <w:rPr>
           <w:rFonts w:ascii="Calibri" w:hAnsi="Calibri" w:cs="Calibri"/>
@@ -2897,25 +2149,7 @@
           <w:sz w:val="22"/>
           <w:szCs w:val="22"/>
         </w:rPr>
-        <w:t xml:space="preserve">The practical form of this condition is knowledge concentration: a plant may run continuously on a system that two certified technicians understand, both of whom are within a few years of retirement. That is a succession risk expressed in production terms rather than in human resources terms, and it is the risk </w:t>
-      </w:r>
-      <w:proofErr w:type="spellStart"/>
-      <w:r>
-        <w:rPr>
-          <w:rFonts w:ascii="Calibri" w:hAnsi="Calibri" w:cs="Calibri"/>
-          <w:sz w:val="22"/>
-          <w:szCs w:val="22"/>
-        </w:rPr>
-        <w:t>SkillSight</w:t>
-      </w:r>
-      <w:proofErr w:type="spellEnd"/>
-      <w:r>
-        <w:rPr>
-          <w:rFonts w:ascii="Calibri" w:hAnsi="Calibri" w:cs="Calibri"/>
-          <w:sz w:val="22"/>
-          <w:szCs w:val="22"/>
-        </w:rPr>
-        <w:t xml:space="preserve"> is designed to surface.</w:t>
+        <w:t>The practical form of this condition is knowledge concentration: a plant may run continuously on a system that two certified technicians understand, both of whom are within a few years of retirement. That is a succession risk expressed in production terms rather than in human resources terms, and it is the risk SkillSight is designed to surface.</w:t>
       </w:r>
     </w:p>
     <w:p>
@@ -2927,7 +2161,7 @@
           <w:szCs w:val="22"/>
         </w:rPr>
       </w:pPr>
-      <w:bookmarkStart w:id="3" w:name="_Toc240156117"/>
+      <w:bookmarkStart w:id="3" w:name="_Toc240158496"/>
       <w:r>
         <w:rPr>
           <w:rFonts w:ascii="Calibri" w:hAnsi="Calibri" w:cs="Calibri"/>
@@ -2971,25 +2205,7 @@
           <w:sz w:val="22"/>
           <w:szCs w:val="22"/>
         </w:rPr>
-        <w:t xml:space="preserve">Food safety provides a second instance. Under the United States Food and Drug Administration's preventive controls framework, a facility's written food safety plan must be prepared, or its preparation overseen, by a preventive controls qualified individual, although the agency mandates no specific certificate and permits qualification through job experience (FDA, n.d.). In both cases, a deployment of </w:t>
-      </w:r>
-      <w:proofErr w:type="spellStart"/>
-      <w:r>
-        <w:rPr>
-          <w:rFonts w:ascii="Calibri" w:hAnsi="Calibri" w:cs="Calibri"/>
-          <w:sz w:val="22"/>
-          <w:szCs w:val="22"/>
-        </w:rPr>
-        <w:t>SkillSight</w:t>
-      </w:r>
-      <w:proofErr w:type="spellEnd"/>
-      <w:r>
-        <w:rPr>
-          <w:rFonts w:ascii="Calibri" w:hAnsi="Calibri" w:cs="Calibri"/>
-          <w:sz w:val="22"/>
-          <w:szCs w:val="22"/>
-        </w:rPr>
-        <w:t xml:space="preserve"> would read an existing record rather than request a new one.</w:t>
+        <w:t>Food safety provides a second instance. Under the United States Food and Drug Administration's preventive controls framework, a facility's written food safety plan must be prepared, or its preparation overseen, by a preventive controls qualified individual, although the agency mandates no specific certificate and permits qualification through job experience (FDA, n.d.). In both cases, a deployment of SkillSight would read an existing record rather than request a new one.</w:t>
       </w:r>
     </w:p>
     <w:p>
@@ -3001,7 +2217,7 @@
           <w:szCs w:val="22"/>
         </w:rPr>
       </w:pPr>
-      <w:bookmarkStart w:id="4" w:name="_Toc240156118"/>
+      <w:bookmarkStart w:id="4" w:name="_Toc240158497"/>
       <w:r>
         <w:rPr>
           <w:rFonts w:ascii="Calibri" w:hAnsi="Calibri" w:cs="Calibri"/>
@@ -3027,25 +2243,7 @@
           <w:sz w:val="22"/>
           <w:szCs w:val="22"/>
         </w:rPr>
-        <w:t xml:space="preserve">Schwan's Company is headquartered in Marshall, Minnesota, and operates as a subsidiary of CJ </w:t>
-      </w:r>
-      <w:proofErr w:type="spellStart"/>
-      <w:r>
-        <w:rPr>
-          <w:rFonts w:ascii="Calibri" w:hAnsi="Calibri" w:cs="Calibri"/>
-          <w:sz w:val="22"/>
-          <w:szCs w:val="22"/>
-        </w:rPr>
-        <w:t>CheilJedang</w:t>
-      </w:r>
-      <w:proofErr w:type="spellEnd"/>
-      <w:r>
-        <w:rPr>
-          <w:rFonts w:ascii="Calibri" w:hAnsi="Calibri" w:cs="Calibri"/>
-          <w:sz w:val="22"/>
-          <w:szCs w:val="22"/>
-        </w:rPr>
-        <w:t>, describing itself as a United States affiliate of CJ Foods (Schwan's Company, n.d.-a). Its careers materials describe more than a dozen United States facilities and four career areas, which this study adopts unchanged as its job groups: Manufacturing and Logistics, Retail Sales and Distribution, Foodservice Sales, and Corporate (Schwan's Company, n.d.-b).</w:t>
+        <w:t>Schwan's Company is headquartered in Marshall, Minnesota, and operates as a subsidiary of CJ CheilJedang, describing itself as a United States affiliate of CJ Foods (Schwan's Company, n.d.-a). Its careers materials describe more than a dozen United States facilities and four career areas, which this study adopts unchanged as its job groups: Manufacturing and Logistics, Retail Sales and Distribution, Foodservice Sales, and Corporate (Schwan's Company, n.d.-b).</w:t>
       </w:r>
     </w:p>
     <w:p>
@@ -3063,43 +2261,7 @@
           <w:sz w:val="22"/>
           <w:szCs w:val="22"/>
         </w:rPr>
-        <w:t xml:space="preserve">Two current business drivers shape the demonstration scenario. The company is constructing a 700,000 square foot Asian-style food production facility in Sioux Falls, South Dakota, expected to create more than 600 plant positions and 50 office positions and to open in 2027 (Schwan's Company, 2024). Separately, its Salina, Kansas pizza plant completed a 400,000 square foot expansion in 2023 that created 225 jobs (Kansas Department of Commerce, 2023). The acquisition by CJ </w:t>
-      </w:r>
-      <w:proofErr w:type="spellStart"/>
-      <w:r>
-        <w:rPr>
-          <w:rFonts w:ascii="Calibri" w:hAnsi="Calibri" w:cs="Calibri"/>
-          <w:sz w:val="22"/>
-          <w:szCs w:val="22"/>
-        </w:rPr>
-        <w:t>CheilJedang</w:t>
-      </w:r>
-      <w:proofErr w:type="spellEnd"/>
-      <w:r>
-        <w:rPr>
-          <w:rFonts w:ascii="Calibri" w:hAnsi="Calibri" w:cs="Calibri"/>
-          <w:sz w:val="22"/>
-          <w:szCs w:val="22"/>
-        </w:rPr>
-        <w:t xml:space="preserve"> expanded that group's United States production base from five sites to 22 (CJ </w:t>
-      </w:r>
-      <w:proofErr w:type="spellStart"/>
-      <w:r>
-        <w:rPr>
-          <w:rFonts w:ascii="Calibri" w:hAnsi="Calibri" w:cs="Calibri"/>
-          <w:sz w:val="22"/>
-          <w:szCs w:val="22"/>
-        </w:rPr>
-        <w:t>CheilJedang</w:t>
-      </w:r>
-      <w:proofErr w:type="spellEnd"/>
-      <w:r>
-        <w:rPr>
-          <w:rFonts w:ascii="Calibri" w:hAnsi="Calibri" w:cs="Calibri"/>
-          <w:sz w:val="22"/>
-          <w:szCs w:val="22"/>
-        </w:rPr>
-        <w:t>, 2019), and CJ Foods relocated its United States headquarters to La Palma, California, in 2023 (Orange County Business Journal, 2023). Each of these facts appears in the tool as the stated reason a future skill target exists.</w:t>
+        <w:t>Two current business drivers shape the demonstration scenario. The company is constructing a 700,000 square foot Asian-style food production facility in Sioux Falls, South Dakota, expected to create more than 600 plant positions and 50 office positions and to open in 2027 (Schwan's Company, 2024). Separately, its Salina, Kansas pizza plant completed a 400,000 square foot expansion in 2023 that created 225 jobs (Kansas Department of Commerce, 2023). The acquisition by CJ CheilJedang expanded that group's United States production base from five sites to 22 (CJ CheilJedang, 2019), and CJ Foods relocated its United States headquarters to La Palma, California, in 2023 (Orange County Business Journal, 2023). Each of these facts appears in the tool as the stated reason a future skill target exists.</w:t>
       </w:r>
     </w:p>
     <w:p>
@@ -3111,7 +2273,7 @@
           <w:szCs w:val="22"/>
         </w:rPr>
       </w:pPr>
-      <w:bookmarkStart w:id="5" w:name="_Toc240156119"/>
+      <w:bookmarkStart w:id="5" w:name="_Toc240158498"/>
       <w:r>
         <w:rPr>
           <w:rFonts w:ascii="Calibri" w:hAnsi="Calibri" w:cs="Calibri"/>
@@ -3131,7 +2293,7 @@
           <w:szCs w:val="22"/>
         </w:rPr>
       </w:pPr>
-      <w:bookmarkStart w:id="6" w:name="_Toc240156120"/>
+      <w:bookmarkStart w:id="6" w:name="_Toc240158499"/>
       <w:r>
         <w:rPr>
           <w:rFonts w:ascii="Calibri" w:hAnsi="Calibri" w:cs="Calibri"/>
@@ -3187,7 +2349,7 @@
           <w:szCs w:val="22"/>
         </w:rPr>
       </w:pPr>
-      <w:bookmarkStart w:id="7" w:name="_Toc240156121"/>
+      <w:bookmarkStart w:id="7" w:name="_Toc240158500"/>
       <w:r>
         <w:rPr>
           <w:rFonts w:ascii="Calibri" w:hAnsi="Calibri" w:cs="Calibri"/>
@@ -3225,7 +2387,7 @@
           <w:szCs w:val="22"/>
         </w:rPr>
       </w:pPr>
-      <w:bookmarkStart w:id="8" w:name="_Toc240156122"/>
+      <w:bookmarkStart w:id="8" w:name="_Toc240158501"/>
       <w:r>
         <w:rPr>
           <w:rFonts w:ascii="Calibri" w:hAnsi="Calibri" w:cs="Calibri"/>
@@ -3263,7 +2425,7 @@
           <w:szCs w:val="22"/>
         </w:rPr>
       </w:pPr>
-      <w:bookmarkStart w:id="9" w:name="_Toc240156123"/>
+      <w:bookmarkStart w:id="9" w:name="_Toc240158502"/>
       <w:r>
         <w:rPr>
           <w:rFonts w:ascii="Calibri" w:hAnsi="Calibri" w:cs="Calibri"/>
@@ -3301,7 +2463,7 @@
           <w:szCs w:val="22"/>
         </w:rPr>
       </w:pPr>
-      <w:bookmarkStart w:id="10" w:name="_Toc240156124"/>
+      <w:bookmarkStart w:id="10" w:name="_Toc240158503"/>
       <w:r>
         <w:rPr>
           <w:rFonts w:ascii="Calibri" w:hAnsi="Calibri" w:cs="Calibri"/>
@@ -3339,7 +2501,7 @@
           <w:szCs w:val="22"/>
         </w:rPr>
       </w:pPr>
-      <w:bookmarkStart w:id="11" w:name="_Toc240156125"/>
+      <w:bookmarkStart w:id="11" w:name="_Toc240158504"/>
       <w:r>
         <w:rPr>
           <w:rFonts w:ascii="Calibri" w:hAnsi="Calibri" w:cs="Calibri"/>
@@ -4137,18 +3299,8 @@
                 <w:sz w:val="22"/>
                 <w:szCs w:val="22"/>
               </w:rPr>
-              <w:t xml:space="preserve">Marshall, MN, R&amp;D </w:t>
-            </w:r>
-            <w:proofErr w:type="spellStart"/>
-            <w:r>
-              <w:rPr>
-                <w:rFonts w:ascii="Calibri" w:hAnsi="Calibri" w:cs="Calibri"/>
-                <w:sz w:val="22"/>
-                <w:szCs w:val="22"/>
-              </w:rPr>
-              <w:t>centre</w:t>
-            </w:r>
-            <w:proofErr w:type="spellEnd"/>
+              <w:t>Marshall, MN, R&amp;D centre</w:t>
+            </w:r>
           </w:p>
         </w:tc>
       </w:tr>
@@ -4696,25 +3848,7 @@
           <w:sz w:val="22"/>
           <w:szCs w:val="22"/>
         </w:rPr>
-        <w:t xml:space="preserve">Table 3 reports the five future skill </w:t>
-      </w:r>
-      <w:proofErr w:type="gramStart"/>
-      <w:r>
-        <w:rPr>
-          <w:rFonts w:ascii="Calibri" w:hAnsi="Calibri" w:cs="Calibri"/>
-          <w:sz w:val="22"/>
-          <w:szCs w:val="22"/>
-        </w:rPr>
-        <w:t>targets,</w:t>
-      </w:r>
-      <w:proofErr w:type="gramEnd"/>
-      <w:r>
-        <w:rPr>
-          <w:rFonts w:ascii="Calibri" w:hAnsi="Calibri" w:cs="Calibri"/>
-          <w:sz w:val="22"/>
-          <w:szCs w:val="22"/>
-        </w:rPr>
-        <w:t xml:space="preserve"> each attached to a documented business driver rather than to a general expectation about technology.</w:t>
+        <w:t>Table 3 reports the five future skill targets, each attached to a documented business driver rather than to a general expectation about technology.</w:t>
       </w:r>
     </w:p>
     <w:p>
@@ -5398,25 +4532,7 @@
           <w:sz w:val="22"/>
           <w:szCs w:val="22"/>
         </w:rPr>
-        <w:t xml:space="preserve">Current and target coverage are simulated. Drivers are sourced; see Schwan's Company (2024) and CJ </w:t>
-      </w:r>
-      <w:proofErr w:type="spellStart"/>
-      <w:r>
-        <w:rPr>
-          <w:rFonts w:ascii="Calibri" w:hAnsi="Calibri" w:cs="Calibri"/>
-          <w:sz w:val="22"/>
-          <w:szCs w:val="22"/>
-        </w:rPr>
-        <w:t>CheilJedang</w:t>
-      </w:r>
-      <w:proofErr w:type="spellEnd"/>
-      <w:r>
-        <w:rPr>
-          <w:rFonts w:ascii="Calibri" w:hAnsi="Calibri" w:cs="Calibri"/>
-          <w:sz w:val="22"/>
-          <w:szCs w:val="22"/>
-        </w:rPr>
-        <w:t xml:space="preserve"> (2019).</w:t>
+        <w:t>Current and target coverage are simulated. Drivers are sourced; see Schwan's Company (2024) and CJ CheilJedang (2019).</w:t>
       </w:r>
     </w:p>
     <w:p>
@@ -6015,7 +5131,7 @@
           <w:szCs w:val="22"/>
         </w:rPr>
       </w:pPr>
-      <w:bookmarkStart w:id="12" w:name="_Toc240156126"/>
+      <w:bookmarkStart w:id="12" w:name="_Toc240158505"/>
       <w:r>
         <w:rPr>
           <w:rFonts w:ascii="Calibri" w:hAnsi="Calibri" w:cs="Calibri"/>
@@ -6035,7 +5151,7 @@
           <w:szCs w:val="22"/>
         </w:rPr>
       </w:pPr>
-      <w:bookmarkStart w:id="13" w:name="_Toc240156127"/>
+      <w:bookmarkStart w:id="13" w:name="_Toc240158506"/>
       <w:r>
         <w:rPr>
           <w:rFonts w:ascii="Calibri" w:hAnsi="Calibri" w:cs="Calibri"/>
@@ -6061,43 +5177,7 @@
           <w:sz w:val="22"/>
           <w:szCs w:val="22"/>
         </w:rPr>
-        <w:t xml:space="preserve">The ranked list is the substantive result. Frozen dough formulation ranks first not because its coverage is lowest, </w:t>
-      </w:r>
-      <w:proofErr w:type="gramStart"/>
-      <w:r>
-        <w:rPr>
-          <w:rFonts w:ascii="Calibri" w:hAnsi="Calibri" w:cs="Calibri"/>
-          <w:sz w:val="22"/>
-          <w:szCs w:val="22"/>
-        </w:rPr>
-        <w:t>which it</w:t>
-      </w:r>
-      <w:proofErr w:type="gramEnd"/>
-      <w:r>
-        <w:rPr>
-          <w:rFonts w:ascii="Calibri" w:hAnsi="Calibri" w:cs="Calibri"/>
-          <w:sz w:val="22"/>
-          <w:szCs w:val="22"/>
-        </w:rPr>
-        <w:t xml:space="preserve"> is not, but because the scarcity term dominates when a single individual holds the skill. This is the </w:t>
-      </w:r>
-      <w:proofErr w:type="spellStart"/>
-      <w:r>
-        <w:rPr>
-          <w:rFonts w:ascii="Calibri" w:hAnsi="Calibri" w:cs="Calibri"/>
-          <w:sz w:val="22"/>
-          <w:szCs w:val="22"/>
-        </w:rPr>
-        <w:t>behaviour</w:t>
-      </w:r>
-      <w:proofErr w:type="spellEnd"/>
-      <w:r>
-        <w:rPr>
-          <w:rFonts w:ascii="Calibri" w:hAnsi="Calibri" w:cs="Calibri"/>
-          <w:sz w:val="22"/>
-          <w:szCs w:val="22"/>
-        </w:rPr>
-        <w:t xml:space="preserve"> a succession planning instrument should exhibit, and it distinguishes the output from a sorted list of coverage percentages.</w:t>
+        <w:t>The ranked list is the substantive result. Frozen dough formulation ranks first not because its coverage is lowest, which it is not, but because the scarcity term dominates when a single individual holds the skill. This is the behaviour a succession planning instrument should exhibit, and it distinguishes the output from a sorted list of coverage percentages.</w:t>
       </w:r>
     </w:p>
     <w:p>
@@ -6109,7 +5189,7 @@
           <w:szCs w:val="22"/>
         </w:rPr>
       </w:pPr>
-      <w:bookmarkStart w:id="14" w:name="_Toc240156128"/>
+      <w:bookmarkStart w:id="14" w:name="_Toc240158507"/>
       <w:r>
         <w:rPr>
           <w:rFonts w:ascii="Calibri" w:hAnsi="Calibri" w:cs="Calibri"/>
@@ -6165,7 +5245,7 @@
           <w:szCs w:val="22"/>
         </w:rPr>
       </w:pPr>
-      <w:bookmarkStart w:id="15" w:name="_Toc240156129"/>
+      <w:bookmarkStart w:id="15" w:name="_Toc240158508"/>
       <w:r>
         <w:rPr>
           <w:rFonts w:ascii="Calibri" w:hAnsi="Calibri" w:cs="Calibri"/>
@@ -6203,7 +5283,7 @@
           <w:szCs w:val="22"/>
         </w:rPr>
       </w:pPr>
-      <w:bookmarkStart w:id="16" w:name="_Toc240156130"/>
+      <w:bookmarkStart w:id="16" w:name="_Toc240158509"/>
       <w:r>
         <w:rPr>
           <w:rFonts w:ascii="Calibri" w:hAnsi="Calibri" w:cs="Calibri"/>
@@ -6243,7 +5323,6 @@
           <w:szCs w:val="22"/>
         </w:rPr>
       </w:pPr>
-      <w:bookmarkStart w:id="17" w:name="_Toc240156131"/>
       <w:r>
         <w:rPr>
           <w:rFonts w:ascii="Calibri" w:hAnsi="Calibri" w:cs="Calibri"/>
@@ -6262,6 +5341,7 @@
           <w:szCs w:val="22"/>
         </w:rPr>
       </w:pPr>
+      <w:bookmarkStart w:id="17" w:name="_Toc240158510"/>
       <w:r>
         <w:rPr>
           <w:rFonts w:ascii="Calibri" w:hAnsi="Calibri" w:cs="Calibri"/>
@@ -6281,59 +5361,13 @@
           <w:szCs w:val="22"/>
         </w:rPr>
       </w:pPr>
-      <w:proofErr w:type="spellStart"/>
-      <w:r>
-        <w:rPr>
-          <w:rFonts w:ascii="Calibri" w:hAnsi="Calibri" w:cs="Calibri"/>
-          <w:sz w:val="22"/>
-          <w:szCs w:val="22"/>
-        </w:rPr>
-        <w:t>SkillSight</w:t>
-      </w:r>
-      <w:proofErr w:type="spellEnd"/>
-      <w:r>
-        <w:rPr>
-          <w:rFonts w:ascii="Calibri" w:hAnsi="Calibri" w:cs="Calibri"/>
-          <w:sz w:val="22"/>
-          <w:szCs w:val="22"/>
-        </w:rPr>
-        <w:t xml:space="preserve"> demonstrates that the useful output of a skills intelligence system is an order of work rather than a display of data. The tool answers the five questions of the prompt in the order they are asked, states on screen which of its numbers are simulated, names the operational systems a real deployment would read, and ranks its findings using a formula a manager can inspect. It is deliberately small: four files, no framework, no </w:t>
-      </w:r>
-      <w:proofErr w:type="gramStart"/>
-      <w:r>
-        <w:rPr>
-          <w:rFonts w:ascii="Calibri" w:hAnsi="Calibri" w:cs="Calibri"/>
-          <w:sz w:val="22"/>
-          <w:szCs w:val="22"/>
-        </w:rPr>
-        <w:t>build</w:t>
-      </w:r>
-      <w:proofErr w:type="gramEnd"/>
-      <w:r>
-        <w:rPr>
-          <w:rFonts w:ascii="Calibri" w:hAnsi="Calibri" w:cs="Calibri"/>
-          <w:sz w:val="22"/>
-          <w:szCs w:val="22"/>
-        </w:rPr>
-        <w:t xml:space="preserve"> step, and no network dependency. The verification script and the fact audit are included in the repository so that both the software </w:t>
-      </w:r>
-      <w:proofErr w:type="spellStart"/>
-      <w:r>
-        <w:rPr>
-          <w:rFonts w:ascii="Calibri" w:hAnsi="Calibri" w:cs="Calibri"/>
-          <w:sz w:val="22"/>
-          <w:szCs w:val="22"/>
-        </w:rPr>
-        <w:t>behaviour</w:t>
-      </w:r>
-      <w:proofErr w:type="spellEnd"/>
-      <w:r>
-        <w:rPr>
-          <w:rFonts w:ascii="Calibri" w:hAnsi="Calibri" w:cs="Calibri"/>
-          <w:sz w:val="22"/>
-          <w:szCs w:val="22"/>
-        </w:rPr>
-        <w:t xml:space="preserve"> and the factual claims can be checked independently.</w:t>
+      <w:r>
+        <w:rPr>
+          <w:rFonts w:ascii="Calibri" w:hAnsi="Calibri" w:cs="Calibri"/>
+          <w:sz w:val="22"/>
+          <w:szCs w:val="22"/>
+        </w:rPr>
+        <w:t>SkillSight demonstrates that the useful output of a skills intelligence system is an order of work rather than a display of data. The tool answers the five questions of the prompt in the order they are asked, states on screen which of its numbers are simulated, names the operational systems a real deployment would read, and ranks its findings using a formula a manager can inspect. It is deliberately small: four files, no framework, no build step, and no network dependency. The verification script and the fact audit are included in the repository so that both the software behaviour and the factual claims can be checked independently.</w:t>
       </w:r>
     </w:p>
     <w:p>
@@ -6388,25 +5422,7 @@
           <w:sz w:val="22"/>
           <w:szCs w:val="22"/>
         </w:rPr>
-        <w:t xml:space="preserve">CJ </w:t>
-      </w:r>
-      <w:proofErr w:type="spellStart"/>
-      <w:r>
-        <w:rPr>
-          <w:rFonts w:ascii="Calibri" w:hAnsi="Calibri" w:cs="Calibri"/>
-          <w:sz w:val="22"/>
-          <w:szCs w:val="22"/>
-        </w:rPr>
-        <w:t>CheilJedang</w:t>
-      </w:r>
-      <w:proofErr w:type="spellEnd"/>
-      <w:r>
-        <w:rPr>
-          <w:rFonts w:ascii="Calibri" w:hAnsi="Calibri" w:cs="Calibri"/>
-          <w:sz w:val="22"/>
-          <w:szCs w:val="22"/>
-        </w:rPr>
-        <w:t xml:space="preserve">. (2019). </w:t>
+        <w:t xml:space="preserve">CJ CheilJedang. (2019). </w:t>
       </w:r>
       <w:r>
         <w:rPr>
@@ -6416,9 +5432,34 @@
           <w:sz w:val="22"/>
           <w:szCs w:val="22"/>
         </w:rPr>
-        <w:t xml:space="preserve">CJ </w:t>
-      </w:r>
-      <w:proofErr w:type="spellStart"/>
+        <w:t>CJ CheilJedang acquires major US food firm Schwan's Company, securing future growth engine to become a leading global top food company</w:t>
+      </w:r>
+      <w:r>
+        <w:rPr>
+          <w:rFonts w:ascii="Calibri" w:hAnsi="Calibri" w:cs="Calibri"/>
+          <w:sz w:val="22"/>
+          <w:szCs w:val="22"/>
+        </w:rPr>
+        <w:t xml:space="preserve"> [Press release]. https://www.cj.co.kr/en/newsroom/pressreleases/news-detail/1283</w:t>
+      </w:r>
+    </w:p>
+    <w:p>
+      <w:pPr>
+        <w:ind w:left="720" w:hanging="720"/>
+        <w:rPr>
+          <w:rFonts w:ascii="Calibri" w:hAnsi="Calibri" w:cs="Calibri"/>
+          <w:sz w:val="22"/>
+          <w:szCs w:val="22"/>
+        </w:rPr>
+      </w:pPr>
+      <w:r>
+        <w:rPr>
+          <w:rFonts w:ascii="Calibri" w:hAnsi="Calibri" w:cs="Calibri"/>
+          <w:sz w:val="22"/>
+          <w:szCs w:val="22"/>
+        </w:rPr>
+        <w:t xml:space="preserve">Deloitte &amp; The Manufacturing Institute. (n.d.). </w:t>
+      </w:r>
       <w:r>
         <w:rPr>
           <w:rFonts w:ascii="Calibri" w:hAnsi="Calibri" w:cs="Calibri"/>
@@ -6427,9 +5468,34 @@
           <w:sz w:val="22"/>
           <w:szCs w:val="22"/>
         </w:rPr>
-        <w:t>CheilJedang</w:t>
-      </w:r>
-      <w:proofErr w:type="spellEnd"/>
+        <w:t>2.1 million manufacturing jobs could go unfilled by 2030</w:t>
+      </w:r>
+      <w:r>
+        <w:rPr>
+          <w:rFonts w:ascii="Calibri" w:hAnsi="Calibri" w:cs="Calibri"/>
+          <w:sz w:val="22"/>
+          <w:szCs w:val="22"/>
+        </w:rPr>
+        <w:t>. The Manufacturing Institute. Retrieved September 13, 2026, from https://themanufacturinginstitute.org/2-1-million-manufacturing-jobs-could-go-unfilled-by-2030-11330/</w:t>
+      </w:r>
+    </w:p>
+    <w:p>
+      <w:pPr>
+        <w:ind w:left="720" w:hanging="720"/>
+        <w:rPr>
+          <w:rFonts w:ascii="Calibri" w:hAnsi="Calibri" w:cs="Calibri"/>
+          <w:sz w:val="22"/>
+          <w:szCs w:val="22"/>
+        </w:rPr>
+      </w:pPr>
+      <w:r>
+        <w:rPr>
+          <w:rFonts w:ascii="Calibri" w:hAnsi="Calibri" w:cs="Calibri"/>
+          <w:sz w:val="22"/>
+          <w:szCs w:val="22"/>
+        </w:rPr>
+        <w:t xml:space="preserve">International Institute of Ammonia Refrigeration. (n.d.). </w:t>
+      </w:r>
       <w:r>
         <w:rPr>
           <w:rFonts w:ascii="Calibri" w:hAnsi="Calibri" w:cs="Calibri"/>
@@ -6438,15 +5504,15 @@
           <w:sz w:val="22"/>
           <w:szCs w:val="22"/>
         </w:rPr>
-        <w:t xml:space="preserve"> acquires major US food firm Schwan's Company, securing future growth engine to become a leading global top food company</w:t>
-      </w:r>
-      <w:r>
-        <w:rPr>
-          <w:rFonts w:ascii="Calibri" w:hAnsi="Calibri" w:cs="Calibri"/>
-          <w:sz w:val="22"/>
-          <w:szCs w:val="22"/>
-        </w:rPr>
-        <w:t xml:space="preserve"> [Press release]. https://www.cj.co.kr/en/newsroom/pressreleases/news-detail/1283</w:t>
+        <w:t>The technician shortage</w:t>
+      </w:r>
+      <w:r>
+        <w:rPr>
+          <w:rFonts w:ascii="Calibri" w:hAnsi="Calibri" w:cs="Calibri"/>
+          <w:sz w:val="22"/>
+          <w:szCs w:val="22"/>
+        </w:rPr>
+        <w:t>. IIAR Condenser. Retrieved September 13, 2026, from https://iiarcondenser.org/the-technician-shortage/</w:t>
       </w:r>
     </w:p>
     <w:p>
@@ -6464,7 +5530,7 @@
           <w:sz w:val="22"/>
           <w:szCs w:val="22"/>
         </w:rPr>
-        <w:t xml:space="preserve">Deloitte &amp; The Manufacturing Institute. (n.d.). </w:t>
+        <w:t xml:space="preserve">Kansas Department of Commerce. (2023, May). </w:t>
       </w:r>
       <w:r>
         <w:rPr>
@@ -6474,15 +5540,15 @@
           <w:sz w:val="22"/>
           <w:szCs w:val="22"/>
         </w:rPr>
-        <w:t>2.1 million manufacturing jobs could go unfilled by 2030</w:t>
-      </w:r>
-      <w:r>
-        <w:rPr>
-          <w:rFonts w:ascii="Calibri" w:hAnsi="Calibri" w:cs="Calibri"/>
-          <w:sz w:val="22"/>
-          <w:szCs w:val="22"/>
-        </w:rPr>
-        <w:t>. The Manufacturing Institute. Retrieved September 13, 2026, from https://themanufacturinginstitute.org/2-1-million-manufacturing-jobs-could-go-unfilled-by-2030-11330/</w:t>
+        <w:t>Governor Kelly congratulates Schwan's for completion of major pizza plant expansion in Salina creating 225 jobs</w:t>
+      </w:r>
+      <w:r>
+        <w:rPr>
+          <w:rFonts w:ascii="Calibri" w:hAnsi="Calibri" w:cs="Calibri"/>
+          <w:sz w:val="22"/>
+          <w:szCs w:val="22"/>
+        </w:rPr>
+        <w:t>. https://www.kansascommerce.gov/2023/05/governor-kelly-congratulates-schwans-for-completion-of-major-pizza-plant-expansion-in-salina-creating-225-jobs/</w:t>
       </w:r>
     </w:p>
     <w:p>
@@ -6500,7 +5566,7 @@
           <w:sz w:val="22"/>
           <w:szCs w:val="22"/>
         </w:rPr>
-        <w:t xml:space="preserve">International Institute of Ammonia Refrigeration. (n.d.). </w:t>
+        <w:t xml:space="preserve">Occupational Safety and Health Administration. (2016, July 21). </w:t>
       </w:r>
       <w:r>
         <w:rPr>
@@ -6510,15 +5576,15 @@
           <w:sz w:val="22"/>
           <w:szCs w:val="22"/>
         </w:rPr>
-        <w:t>The technician shortage</w:t>
-      </w:r>
-      <w:r>
-        <w:rPr>
-          <w:rFonts w:ascii="Calibri" w:hAnsi="Calibri" w:cs="Calibri"/>
-          <w:sz w:val="22"/>
-          <w:szCs w:val="22"/>
-        </w:rPr>
-        <w:t>. IIAR Condenser. Retrieved September 13, 2026, from https://iiarcondenser.org/the-technician-shortage/</w:t>
+        <w:t>Process safety management of highly hazardous chemicals and covered concentrations of listed appendix A chemicals</w:t>
+      </w:r>
+      <w:r>
+        <w:rPr>
+          <w:rFonts w:ascii="Calibri" w:hAnsi="Calibri" w:cs="Calibri"/>
+          <w:sz w:val="22"/>
+          <w:szCs w:val="22"/>
+        </w:rPr>
+        <w:t xml:space="preserve"> [Standard interpretation]. United States Department of Labor. https://www.osha.gov/laws-regs/standardinterpretations/2016-07-21</w:t>
       </w:r>
     </w:p>
     <w:p>
@@ -6536,7 +5602,7 @@
           <w:sz w:val="22"/>
           <w:szCs w:val="22"/>
         </w:rPr>
-        <w:t xml:space="preserve">Kansas Department of Commerce. (2023, May). </w:t>
+        <w:t xml:space="preserve">Orange County Business Journal. (2023). </w:t>
       </w:r>
       <w:r>
         <w:rPr>
@@ -6546,15 +5612,15 @@
           <w:sz w:val="22"/>
           <w:szCs w:val="22"/>
         </w:rPr>
-        <w:t>Governor Kelly congratulates Schwan's for completion of major pizza plant expansion in Salina creating 225 jobs</w:t>
-      </w:r>
-      <w:r>
-        <w:rPr>
-          <w:rFonts w:ascii="Calibri" w:hAnsi="Calibri" w:cs="Calibri"/>
-          <w:sz w:val="22"/>
-          <w:szCs w:val="22"/>
-        </w:rPr>
-        <w:t>. https://www.kansascommerce.gov/2023/05/governor-kelly-congratulates-schwans-for-completion-of-major-pizza-plant-expansion-in-salina-creating-225-jobs/</w:t>
+        <w:t>CJ Foods follows Fullerton plant with new HQ in La Palma</w:t>
+      </w:r>
+      <w:r>
+        <w:rPr>
+          <w:rFonts w:ascii="Calibri" w:hAnsi="Calibri" w:cs="Calibri"/>
+          <w:sz w:val="22"/>
+          <w:szCs w:val="22"/>
+        </w:rPr>
+        <w:t>. https://www.ocbj.com/real-estate/cj-foods-follows-fullerton-plant-new-hq-la-palma/</w:t>
       </w:r>
     </w:p>
     <w:p>
@@ -6572,7 +5638,7 @@
           <w:sz w:val="22"/>
           <w:szCs w:val="22"/>
         </w:rPr>
-        <w:t xml:space="preserve">Occupational Safety and Health Administration. (2016, July 21). </w:t>
+        <w:t xml:space="preserve">Schwan's Company. (n.d.-a). </w:t>
       </w:r>
       <w:r>
         <w:rPr>
@@ -6582,15 +5648,15 @@
           <w:sz w:val="22"/>
           <w:szCs w:val="22"/>
         </w:rPr>
-        <w:t>Process safety management of highly hazardous chemicals and covered concentrations of listed appendix A chemicals</w:t>
-      </w:r>
-      <w:r>
-        <w:rPr>
-          <w:rFonts w:ascii="Calibri" w:hAnsi="Calibri" w:cs="Calibri"/>
-          <w:sz w:val="22"/>
-          <w:szCs w:val="22"/>
-        </w:rPr>
-        <w:t xml:space="preserve"> [Standard interpretation]. United States Department of Labor. https://www.osha.gov/laws-regs/standardinterpretations/2016-07-21</w:t>
+        <w:t>About us</w:t>
+      </w:r>
+      <w:r>
+        <w:rPr>
+          <w:rFonts w:ascii="Calibri" w:hAnsi="Calibri" w:cs="Calibri"/>
+          <w:sz w:val="22"/>
+          <w:szCs w:val="22"/>
+        </w:rPr>
+        <w:t>. Retrieved September 13, 2026, from https://www.schwanscompany.com/about-us/</w:t>
       </w:r>
     </w:p>
     <w:p>
@@ -6608,7 +5674,7 @@
           <w:sz w:val="22"/>
           <w:szCs w:val="22"/>
         </w:rPr>
-        <w:t xml:space="preserve">Orange County Business Journal. (2023). </w:t>
+        <w:t xml:space="preserve">Schwan's Company. (n.d.-b). </w:t>
       </w:r>
       <w:r>
         <w:rPr>
@@ -6618,15 +5684,15 @@
           <w:sz w:val="22"/>
           <w:szCs w:val="22"/>
         </w:rPr>
-        <w:t>CJ Foods follows Fullerton plant with new HQ in La Palma</w:t>
-      </w:r>
-      <w:r>
-        <w:rPr>
-          <w:rFonts w:ascii="Calibri" w:hAnsi="Calibri" w:cs="Calibri"/>
-          <w:sz w:val="22"/>
-          <w:szCs w:val="22"/>
-        </w:rPr>
-        <w:t>. https://www.ocbj.com/real-estate/cj-foods-follows-fullerton-plant-new-hq-la-palma/</w:t>
+        <w:t>Careers</w:t>
+      </w:r>
+      <w:r>
+        <w:rPr>
+          <w:rFonts w:ascii="Calibri" w:hAnsi="Calibri" w:cs="Calibri"/>
+          <w:sz w:val="22"/>
+          <w:szCs w:val="22"/>
+        </w:rPr>
+        <w:t>. Retrieved September 13, 2026, from https://www.schwansjobs.com/</w:t>
       </w:r>
     </w:p>
     <w:p>
@@ -6644,7 +5710,7 @@
           <w:sz w:val="22"/>
           <w:szCs w:val="22"/>
         </w:rPr>
-        <w:t xml:space="preserve">Schwan's Company. (n.d.-a). </w:t>
+        <w:t xml:space="preserve">Schwan's Company. (2024, May). </w:t>
       </w:r>
       <w:r>
         <w:rPr>
@@ -6654,15 +5720,15 @@
           <w:sz w:val="22"/>
           <w:szCs w:val="22"/>
         </w:rPr>
-        <w:t>About us</w:t>
-      </w:r>
-      <w:r>
-        <w:rPr>
-          <w:rFonts w:ascii="Calibri" w:hAnsi="Calibri" w:cs="Calibri"/>
-          <w:sz w:val="22"/>
-          <w:szCs w:val="22"/>
-        </w:rPr>
-        <w:t>. Retrieved September 13, 2026, from https://www.schwanscompany.com/about-us/</w:t>
+        <w:t>Schwan's Company and State of South Dakota announce future investments in Sioux Falls to support new food production facility</w:t>
+      </w:r>
+      <w:r>
+        <w:rPr>
+          <w:rFonts w:ascii="Calibri" w:hAnsi="Calibri" w:cs="Calibri"/>
+          <w:sz w:val="22"/>
+          <w:szCs w:val="22"/>
+        </w:rPr>
+        <w:t xml:space="preserve"> [Press release]. PR Newswire. https://www.prnewswire.com/news-releases/schwans-company-and-state-of-south-dakota-announce-future-investments-in-sioux-falls-to-support-new-food-production-facility-302159947.html</w:t>
       </w:r>
     </w:p>
     <w:p>
@@ -6680,7 +5746,7 @@
           <w:sz w:val="22"/>
           <w:szCs w:val="22"/>
         </w:rPr>
-        <w:t xml:space="preserve">Schwan's Company. (n.d.-b). </w:t>
+        <w:t xml:space="preserve">United States Food and Drug Administration. (n.d.). </w:t>
       </w:r>
       <w:r>
         <w:rPr>
@@ -6690,78 +5756,6 @@
           <w:sz w:val="22"/>
           <w:szCs w:val="22"/>
         </w:rPr>
-        <w:t>Careers</w:t>
-      </w:r>
-      <w:r>
-        <w:rPr>
-          <w:rFonts w:ascii="Calibri" w:hAnsi="Calibri" w:cs="Calibri"/>
-          <w:sz w:val="22"/>
-          <w:szCs w:val="22"/>
-        </w:rPr>
-        <w:t>. Retrieved September 13, 2026, from https://www.schwansjobs.com/</w:t>
-      </w:r>
-    </w:p>
-    <w:p>
-      <w:pPr>
-        <w:ind w:left="720" w:hanging="720"/>
-        <w:rPr>
-          <w:rFonts w:ascii="Calibri" w:hAnsi="Calibri" w:cs="Calibri"/>
-          <w:sz w:val="22"/>
-          <w:szCs w:val="22"/>
-        </w:rPr>
-      </w:pPr>
-      <w:r>
-        <w:rPr>
-          <w:rFonts w:ascii="Calibri" w:hAnsi="Calibri" w:cs="Calibri"/>
-          <w:sz w:val="22"/>
-          <w:szCs w:val="22"/>
-        </w:rPr>
-        <w:t xml:space="preserve">Schwan's Company. (2024, May). </w:t>
-      </w:r>
-      <w:r>
-        <w:rPr>
-          <w:rFonts w:ascii="Calibri" w:hAnsi="Calibri" w:cs="Calibri"/>
-          <w:i/>
-          <w:iCs/>
-          <w:sz w:val="22"/>
-          <w:szCs w:val="22"/>
-        </w:rPr>
-        <w:t>Schwan's Company and State of South Dakota announce future investments in Sioux Falls to support new food production facility</w:t>
-      </w:r>
-      <w:r>
-        <w:rPr>
-          <w:rFonts w:ascii="Calibri" w:hAnsi="Calibri" w:cs="Calibri"/>
-          <w:sz w:val="22"/>
-          <w:szCs w:val="22"/>
-        </w:rPr>
-        <w:t xml:space="preserve"> [Press release]. PR Newswire. https://www.prnewswire.com/news-releases/schwans-company-and-state-of-south-dakota-announce-future-investments-in-sioux-falls-to-support-new-food-production-facility-302159947.html</w:t>
-      </w:r>
-    </w:p>
-    <w:p>
-      <w:pPr>
-        <w:ind w:left="720" w:hanging="720"/>
-        <w:rPr>
-          <w:rFonts w:ascii="Calibri" w:hAnsi="Calibri" w:cs="Calibri"/>
-          <w:sz w:val="22"/>
-          <w:szCs w:val="22"/>
-        </w:rPr>
-      </w:pPr>
-      <w:r>
-        <w:rPr>
-          <w:rFonts w:ascii="Calibri" w:hAnsi="Calibri" w:cs="Calibri"/>
-          <w:sz w:val="22"/>
-          <w:szCs w:val="22"/>
-        </w:rPr>
-        <w:t xml:space="preserve">United States Food and Drug Administration. (n.d.). </w:t>
-      </w:r>
-      <w:r>
-        <w:rPr>
-          <w:rFonts w:ascii="Calibri" w:hAnsi="Calibri" w:cs="Calibri"/>
-          <w:i/>
-          <w:iCs/>
-          <w:sz w:val="22"/>
-          <w:szCs w:val="22"/>
-        </w:rPr>
         <w:t>Frequently asked questions on FSMA</w:t>
       </w:r>
       <w:r>
@@ -6799,7 +5793,7 @@
           <w:szCs w:val="22"/>
         </w:rPr>
       </w:pPr>
-      <w:bookmarkStart w:id="18" w:name="_Toc240156132"/>
+      <w:bookmarkStart w:id="18" w:name="_Toc240158511"/>
       <w:r>
         <w:rPr>
           <w:rFonts w:ascii="Calibri" w:hAnsi="Calibri" w:cs="Calibri"/>
@@ -6882,23 +5876,13 @@
           <w:szCs w:val="22"/>
         </w:rPr>
       </w:pPr>
-      <w:proofErr w:type="spellStart"/>
-      <w:r>
-        <w:rPr>
-          <w:rFonts w:ascii="Calibri" w:hAnsi="Calibri" w:cs="Calibri"/>
-          <w:sz w:val="22"/>
-          <w:szCs w:val="22"/>
-        </w:rPr>
-        <w:t>successionRisks</w:t>
-      </w:r>
-      <w:proofErr w:type="spellEnd"/>
-      <w:r>
-        <w:rPr>
-          <w:rFonts w:ascii="Calibri" w:hAnsi="Calibri" w:cs="Calibri"/>
-          <w:sz w:val="22"/>
-          <w:szCs w:val="22"/>
-        </w:rPr>
-        <w:t>: six records with skill, segment, location, headcount, impact from 1 to 5, and an explanatory note.</w:t>
+      <w:r>
+        <w:rPr>
+          <w:rFonts w:ascii="Calibri" w:hAnsi="Calibri" w:cs="Calibri"/>
+          <w:sz w:val="22"/>
+          <w:szCs w:val="22"/>
+        </w:rPr>
+        <w:t>successionRisks: six records with skill, segment, location, headcount, impact from 1 to 5, and an explanatory note.</w:t>
       </w:r>
     </w:p>
     <w:p>
@@ -6914,23 +5898,13 @@
           <w:szCs w:val="22"/>
         </w:rPr>
       </w:pPr>
-      <w:proofErr w:type="spellStart"/>
-      <w:r>
-        <w:rPr>
-          <w:rFonts w:ascii="Calibri" w:hAnsi="Calibri" w:cs="Calibri"/>
-          <w:sz w:val="22"/>
-          <w:szCs w:val="22"/>
-        </w:rPr>
-        <w:t>futureSkills</w:t>
-      </w:r>
-      <w:proofErr w:type="spellEnd"/>
-      <w:r>
-        <w:rPr>
-          <w:rFonts w:ascii="Calibri" w:hAnsi="Calibri" w:cs="Calibri"/>
-          <w:sz w:val="22"/>
-          <w:szCs w:val="22"/>
-        </w:rPr>
-        <w:t>: five records with current coverage, target coverage for 2027, and the business driver.</w:t>
+      <w:r>
+        <w:rPr>
+          <w:rFonts w:ascii="Calibri" w:hAnsi="Calibri" w:cs="Calibri"/>
+          <w:sz w:val="22"/>
+          <w:szCs w:val="22"/>
+        </w:rPr>
+        <w:t>futureSkills: five records with current coverage, target coverage for 2027, and the business driver.</w:t>
       </w:r>
     </w:p>
     <w:p>
@@ -6946,23 +5920,13 @@
           <w:szCs w:val="22"/>
         </w:rPr>
       </w:pPr>
-      <w:proofErr w:type="spellStart"/>
-      <w:r>
-        <w:rPr>
-          <w:rFonts w:ascii="Calibri" w:hAnsi="Calibri" w:cs="Calibri"/>
-          <w:sz w:val="22"/>
-          <w:szCs w:val="22"/>
-        </w:rPr>
-        <w:t>recommendedActions</w:t>
-      </w:r>
-      <w:proofErr w:type="spellEnd"/>
-      <w:r>
-        <w:rPr>
-          <w:rFonts w:ascii="Calibri" w:hAnsi="Calibri" w:cs="Calibri"/>
-          <w:sz w:val="22"/>
-          <w:szCs w:val="22"/>
-        </w:rPr>
-        <w:t>: ten primary development actions keyed by skill, each with a method and a detail.</w:t>
+      <w:r>
+        <w:rPr>
+          <w:rFonts w:ascii="Calibri" w:hAnsi="Calibri" w:cs="Calibri"/>
+          <w:sz w:val="22"/>
+          <w:szCs w:val="22"/>
+        </w:rPr>
+        <w:t>recommendedActions: ten primary development actions keyed by skill, each with a method and a detail.</w:t>
       </w:r>
     </w:p>
     <w:p>
@@ -6978,23 +5942,13 @@
           <w:szCs w:val="22"/>
         </w:rPr>
       </w:pPr>
-      <w:proofErr w:type="spellStart"/>
-      <w:r>
-        <w:rPr>
-          <w:rFonts w:ascii="Calibri" w:hAnsi="Calibri" w:cs="Calibri"/>
-          <w:sz w:val="22"/>
-          <w:szCs w:val="22"/>
-        </w:rPr>
-        <w:t>alternateActions</w:t>
-      </w:r>
-      <w:proofErr w:type="spellEnd"/>
-      <w:r>
-        <w:rPr>
-          <w:rFonts w:ascii="Calibri" w:hAnsi="Calibri" w:cs="Calibri"/>
-          <w:sz w:val="22"/>
-          <w:szCs w:val="22"/>
-        </w:rPr>
-        <w:t>: sixteen alternative actions, grouped by skill, used where a primary action exists.</w:t>
+      <w:r>
+        <w:rPr>
+          <w:rFonts w:ascii="Calibri" w:hAnsi="Calibri" w:cs="Calibri"/>
+          <w:sz w:val="22"/>
+          <w:szCs w:val="22"/>
+        </w:rPr>
+        <w:t>alternateActions: sixteen alternative actions, grouped by skill, used where a primary action exists.</w:t>
       </w:r>
     </w:p>
     <w:p>
@@ -7032,23 +5986,13 @@
           <w:szCs w:val="22"/>
         </w:rPr>
       </w:pPr>
-      <w:proofErr w:type="spellStart"/>
-      <w:r>
-        <w:rPr>
-          <w:rFonts w:ascii="Calibri" w:hAnsi="Calibri" w:cs="Calibri"/>
-          <w:sz w:val="22"/>
-          <w:szCs w:val="22"/>
-        </w:rPr>
-        <w:t>dataSources</w:t>
-      </w:r>
-      <w:proofErr w:type="spellEnd"/>
-      <w:r>
-        <w:rPr>
-          <w:rFonts w:ascii="Calibri" w:hAnsi="Calibri" w:cs="Calibri"/>
-          <w:sz w:val="22"/>
-          <w:szCs w:val="22"/>
-        </w:rPr>
-        <w:t>: provenance for each skill, naming the operational systems a real deployment would read, with regulatory citations where they apply.</w:t>
+      <w:r>
+        <w:rPr>
+          <w:rFonts w:ascii="Calibri" w:hAnsi="Calibri" w:cs="Calibri"/>
+          <w:sz w:val="22"/>
+          <w:szCs w:val="22"/>
+        </w:rPr>
+        <w:t>dataSources: provenance for each skill, naming the operational systems a real deployment would read, with regulatory citations where they apply.</w:t>
       </w:r>
     </w:p>
     <w:p>
@@ -7064,23 +6008,13 @@
           <w:szCs w:val="22"/>
         </w:rPr>
       </w:pPr>
-      <w:proofErr w:type="spellStart"/>
-      <w:r>
-        <w:rPr>
-          <w:rFonts w:ascii="Calibri" w:hAnsi="Calibri" w:cs="Calibri"/>
-          <w:sz w:val="22"/>
-          <w:szCs w:val="22"/>
-        </w:rPr>
-        <w:t>demoNotes</w:t>
-      </w:r>
-      <w:proofErr w:type="spellEnd"/>
-      <w:r>
-        <w:rPr>
-          <w:rFonts w:ascii="Calibri" w:hAnsi="Calibri" w:cs="Calibri"/>
-          <w:sz w:val="22"/>
-          <w:szCs w:val="22"/>
-        </w:rPr>
-        <w:t>: the on-screen statement of assumptions and the list of ten external sources.</w:t>
+      <w:r>
+        <w:rPr>
+          <w:rFonts w:ascii="Calibri" w:hAnsi="Calibri" w:cs="Calibri"/>
+          <w:sz w:val="22"/>
+          <w:szCs w:val="22"/>
+        </w:rPr>
+        <w:t>demoNotes: the on-screen statement of assumptions and the list of ten external sources.</w:t>
       </w:r>
     </w:p>
     <w:p>
@@ -7109,7 +6043,7 @@
           <w:szCs w:val="22"/>
         </w:rPr>
       </w:pPr>
-      <w:bookmarkStart w:id="19" w:name="_Toc240156133"/>
+      <w:bookmarkStart w:id="19" w:name="_Toc240158512"/>
       <w:r>
         <w:rPr>
           <w:rFonts w:ascii="Calibri" w:hAnsi="Calibri" w:cs="Calibri"/>
@@ -7239,25 +6173,7 @@
           <w:sz w:val="22"/>
           <w:szCs w:val="22"/>
         </w:rPr>
-        <w:t xml:space="preserve">For PLC automation programming, which ranks fifth: impact 0.80, scarcity 3 divided by 3 holders = 1.00, gap 0.4 plus 0.66 = 1.06, giving a score of 0.85. The ratio of roughly 3.4 to 1 between the two reflects the scarcity term, which is the intended </w:t>
-      </w:r>
-      <w:proofErr w:type="spellStart"/>
-      <w:r>
-        <w:rPr>
-          <w:rFonts w:ascii="Calibri" w:hAnsi="Calibri" w:cs="Calibri"/>
-          <w:sz w:val="22"/>
-          <w:szCs w:val="22"/>
-        </w:rPr>
-        <w:t>behaviour</w:t>
-      </w:r>
-      <w:proofErr w:type="spellEnd"/>
-      <w:r>
-        <w:rPr>
-          <w:rFonts w:ascii="Calibri" w:hAnsi="Calibri" w:cs="Calibri"/>
-          <w:sz w:val="22"/>
-          <w:szCs w:val="22"/>
-        </w:rPr>
-        <w:t xml:space="preserve"> of the model.</w:t>
+        <w:t>For PLC automation programming, which ranks fifth: impact 0.80, scarcity 3 divided by 3 holders = 1.00, gap 0.4 plus 0.66 = 1.06, giving a score of 0.85. The ratio of roughly 3.4 to 1 between the two reflects the scarcity term, which is the intended behaviour of the model.</w:t>
       </w:r>
     </w:p>
     <w:p>
@@ -7286,7 +6202,7 @@
           <w:szCs w:val="22"/>
         </w:rPr>
       </w:pPr>
-      <w:bookmarkStart w:id="20" w:name="_Toc240156134"/>
+      <w:bookmarkStart w:id="20" w:name="_Toc240158513"/>
       <w:r>
         <w:rPr>
           <w:rFonts w:ascii="Calibri" w:hAnsi="Calibri" w:cs="Calibri"/>
@@ -8331,7 +7247,7 @@
           <w:szCs w:val="22"/>
         </w:rPr>
       </w:pPr>
-      <w:bookmarkStart w:id="21" w:name="_Toc240156135"/>
+      <w:bookmarkStart w:id="21" w:name="_Toc240158514"/>
       <w:r>
         <w:rPr>
           <w:rFonts w:ascii="Calibri" w:hAnsi="Calibri" w:cs="Calibri"/>
@@ -8754,25 +7670,7 @@
                 <w:sz w:val="22"/>
                 <w:szCs w:val="22"/>
               </w:rPr>
-              <w:t xml:space="preserve">A </w:t>
-            </w:r>
-            <w:proofErr w:type="gramStart"/>
-            <w:r>
-              <w:rPr>
-                <w:rFonts w:ascii="Calibri" w:hAnsi="Calibri" w:cs="Calibri"/>
-                <w:sz w:val="22"/>
-                <w:szCs w:val="22"/>
-              </w:rPr>
-              <w:t>started</w:t>
-            </w:r>
-            <w:proofErr w:type="gramEnd"/>
-            <w:r>
-              <w:rPr>
-                <w:rFonts w:ascii="Calibri" w:hAnsi="Calibri" w:cs="Calibri"/>
-                <w:sz w:val="22"/>
-                <w:szCs w:val="22"/>
-              </w:rPr>
-              <w:t xml:space="preserve"> plan is visible in every list containing that skill</w:t>
+              <w:t>A started plan is visible in every list containing that skill</w:t>
             </w:r>
           </w:p>
         </w:tc>

</xml_diff>